<commit_message>
Fix resume email and education layout
</commit_message>
<xml_diff>
--- a/resume_engine/new_template.docx
+++ b/resume_engine/new_template.docx
@@ -18,8 +18,8 @@
         <w:tblLook w:val="04A0" w:firstRow="1" w:lastRow="0" w:firstColumn="1" w:lastColumn="0" w:noHBand="0" w:noVBand="1"/>
       </w:tblPr>
       <w:tblGrid>
-        <w:gridCol w:w="8475"/>
-        <w:gridCol w:w="1991"/>
+        <w:gridCol w:w="8477"/>
+        <w:gridCol w:w="1989"/>
       </w:tblGrid>
       <w:tr>
         <w:tc>
@@ -30,11 +30,6 @@
           <w:p>
             <w:pPr>
               <w:jc w:val="center"/>
-              <w:rPr>
-                <w:rFonts w:cstheme="minorHAnsi"/>
-                <w:sz w:val="32"/>
-                <w:szCs w:val="32"/>
-              </w:rPr>
             </w:pPr>
             <w:r>
               <w:rPr>
@@ -62,102 +57,93 @@
             <w:r>
               <w:rPr>
                 <w:rFonts w:cstheme="minorHAnsi"/>
-              </w:rPr>
-              <w:t xml:space="preserve">+1 </w:t>
-            </w:r>
-            <w:r>
-              <w:rPr>
-                <w:rFonts w:cstheme="minorHAnsi"/>
-              </w:rPr>
-              <w:t>(</w:t>
-            </w:r>
-            <w:r>
-              <w:rPr>
-                <w:rFonts w:cstheme="minorHAnsi"/>
-              </w:rPr>
-              <w:t>951</w:t>
-            </w:r>
-            <w:r>
-              <w:rPr>
-                <w:rFonts w:cstheme="minorHAnsi"/>
-              </w:rPr>
-              <w:t>)</w:t>
-            </w:r>
-            <w:r>
-              <w:rPr>
-                <w:rFonts w:cstheme="minorHAnsi"/>
-              </w:rPr>
-              <w:t>-</w:t>
-            </w:r>
-            <w:r>
-              <w:rPr>
-                <w:rFonts w:cstheme="minorHAnsi"/>
-              </w:rPr>
-              <w:t>347-</w:t>
-            </w:r>
-            <w:r>
-              <w:rPr>
-                <w:rFonts w:cstheme="minorHAnsi"/>
-              </w:rPr>
-              <w:t>5278</w:t>
-            </w:r>
-            <w:r>
-              <w:rPr>
-                <w:rFonts w:cstheme="minorHAnsi"/>
-              </w:rPr>
-              <w:t xml:space="preserve"> | </w:t>
+                <w:sz w:val="20"/>
+                <w:szCs w:val="20"/>
+              </w:rPr>
+              <w:t xml:space="preserve">+1 (951)-347-5278 | </w:t>
             </w:r>
             <w:hyperlink r:id="rId6" w:history="1">
               <w:r>
                 <w:rPr>
                   <w:rStyle w:val="Hyperlink"/>
                   <w:rFonts w:cstheme="minorHAnsi"/>
+                  <w:sz w:val="20"/>
+                  <w:szCs w:val="20"/>
                 </w:rPr>
-                <w:t>sagar035@ucr.edu</w:t>
+                <w:t>shrujalag.gms@gmail.com</w:t>
               </w:r>
             </w:hyperlink>
             <w:r>
               <w:rPr>
                 <w:rFonts w:cstheme="minorHAnsi"/>
-              </w:rPr>
-              <w:t xml:space="preserve"> |</w:t>
+                <w:sz w:val="20"/>
+                <w:szCs w:val="20"/>
+              </w:rPr>
+              <w:t xml:space="preserve"> | </w:t>
             </w:r>
-            <w:r>
-              <w:rPr>
-                <w:rFonts w:cstheme="minorHAnsi"/>
-              </w:rPr>
-              <w:t xml:space="preserve"> </w:t>
-            </w:r>
-            <w:hyperlink r:id="rId7" w:tgtFrame="_blank" w:history="1">
+            <w:hyperlink r:id="rId7" w:history="1">
               <w:r>
                 <w:rPr>
                   <w:rStyle w:val="Hyperlink"/>
                   <w:rFonts w:cstheme="minorHAnsi"/>
+                  <w:sz w:val="20"/>
+                  <w:szCs w:val="20"/>
                 </w:rPr>
                 <w:t>LinkedIn</w:t>
               </w:r>
             </w:hyperlink>
             <w:r>
-              <w:t xml:space="preserve"> </w:t>
-            </w:r>
-            <w:r>
-              <w:t xml:space="preserve">| </w:t>
+              <w:rPr>
+                <w:rFonts w:cstheme="minorHAnsi"/>
+                <w:sz w:val="20"/>
+                <w:szCs w:val="20"/>
+              </w:rPr>
+              <w:t xml:space="preserve"> | </w:t>
             </w:r>
             <w:hyperlink r:id="rId8" w:history="1">
               <w:r>
                 <w:rPr>
                   <w:rStyle w:val="Hyperlink"/>
+                  <w:rFonts w:cstheme="minorHAnsi"/>
+                  <w:sz w:val="20"/>
+                  <w:szCs w:val="20"/>
                 </w:rPr>
-                <w:t>Portfolio</w:t>
+                <w:t>Port</w:t>
+              </w:r>
+              <w:r>
+                <w:rPr>
+                  <w:rStyle w:val="Hyperlink"/>
+                  <w:rFonts w:cstheme="minorHAnsi"/>
+                  <w:sz w:val="20"/>
+                  <w:szCs w:val="20"/>
+                </w:rPr>
+                <w:t>f</w:t>
+              </w:r>
+              <w:r>
+                <w:rPr>
+                  <w:rStyle w:val="Hyperlink"/>
+                  <w:rFonts w:cstheme="minorHAnsi"/>
+                  <w:sz w:val="20"/>
+                  <w:szCs w:val="20"/>
+                </w:rPr>
+                <w:t>olio</w:t>
               </w:r>
             </w:hyperlink>
             <w:r>
+              <w:rPr>
+                <w:rFonts w:cstheme="minorHAnsi"/>
+                <w:sz w:val="20"/>
+                <w:szCs w:val="20"/>
+              </w:rPr>
               <w:t xml:space="preserve"> | </w:t>
             </w:r>
             <w:hyperlink r:id="rId9" w:history="1">
               <w:r>
                 <w:rPr>
                   <w:rStyle w:val="Hyperlink"/>
+                  <w:rFonts w:cstheme="minorHAnsi"/>
+                  <w:sz w:val="20"/>
+                  <w:szCs w:val="20"/>
                 </w:rPr>
                 <w:t>GitHub</w:t>
               </w:r>
@@ -176,35 +162,26 @@
           </w:tcPr>
           <w:p>
             <w:pPr>
-              <w:spacing w:before="120"/>
-              <w:jc w:val="both"/>
-              <w:rPr>
-                <w:rFonts w:cstheme="minorHAnsi"/>
-                <w:b/>
-                <w:bCs/>
-                <w:sz w:val="20"/>
-                <w:szCs w:val="20"/>
-              </w:rPr>
-            </w:pPr>
-            <w:r>
-              <w:rPr>
+              <w:spacing w:before="60"/>
+              <w:rPr>
+                <w:rFonts w:cstheme="minorHAnsi"/>
                 <w:b/>
                 <w:bCs/>
                 <w:color w:val="2F5496" w:themeColor="accent1" w:themeShade="BF"/>
                 <w:sz w:val="20"/>
                 <w:szCs w:val="20"/>
               </w:rPr>
-              <w:t>PROFESSIONAL SUMMARY</w:t>
-            </w:r>
+            </w:pPr>
             <w:r>
               <w:rPr>
+                <w:rFonts w:cstheme="minorHAnsi"/>
                 <w:b/>
                 <w:bCs/>
                 <w:color w:val="2F5496" w:themeColor="accent1" w:themeShade="BF"/>
                 <w:sz w:val="20"/>
                 <w:szCs w:val="20"/>
               </w:rPr>
-              <w:t xml:space="preserve"> </w:t>
+              <w:t>PROFESSIONAL SUMMARY</w:t>
             </w:r>
           </w:p>
         </w:tc>
@@ -218,38 +195,14 @@
           <w:p>
             <w:pPr>
               <w:jc w:val="both"/>
-              <w:rPr>
-                <w:rFonts w:cstheme="minorHAnsi"/>
-                <w:sz w:val="20"/>
-                <w:szCs w:val="20"/>
-                <w:lang w:val="en-IN"/>
-              </w:rPr>
             </w:pPr>
             <w:r>
               <w:rPr>
                 <w:rFonts w:cstheme="minorHAnsi"/>
                 <w:sz w:val="20"/>
                 <w:szCs w:val="20"/>
-                <w:lang w:val="en-IN"/>
-              </w:rPr>
-              <w:t>MBA candidate with 2+ years of experience across strategy, operations, and analytics at Goldman Sachs, Thomson Reuters, and startup environments</w:t>
-            </w:r>
-            <w:r>
-              <w:rPr>
-                <w:rFonts w:cstheme="minorHAnsi"/>
-                <w:sz w:val="20"/>
-                <w:szCs w:val="20"/>
-                <w:lang w:val="en-IN"/>
-              </w:rPr>
-              <w:t xml:space="preserve">. </w:t>
-            </w:r>
-            <w:r>
-              <w:rPr>
-                <w:rFonts w:cstheme="minorHAnsi"/>
-                <w:sz w:val="20"/>
-                <w:szCs w:val="20"/>
-              </w:rPr>
-              <w:t>Strong at bringing structure to ambiguous business problems, building leadership-ready insights, and improving reporting rhythms that support business planning and execution.</w:t>
+              </w:rPr>
+              <w:t>MBA graduate from UC Riverside (GPA 3.8) with 3+ years across strategy, analytics, and operations within Fortune 500 organizations and startup environments. Skilled at translating ambiguous business problems into fact-based analysis, reporting, and executive-ready recommendations while partnering across finance, operations, and marketing teams.</w:t>
             </w:r>
           </w:p>
         </w:tc>
@@ -266,15 +219,18 @@
           <w:p>
             <w:pPr>
               <w:spacing w:before="120"/>
-              <w:jc w:val="both"/>
-              <w:rPr>
-                <w:rFonts w:cstheme="minorHAnsi"/>
+              <w:rPr>
+                <w:rFonts w:cstheme="minorHAnsi"/>
+                <w:b/>
+                <w:bCs/>
+                <w:color w:val="2F5496" w:themeColor="accent1" w:themeShade="BF"/>
                 <w:sz w:val="20"/>
                 <w:szCs w:val="20"/>
               </w:rPr>
             </w:pPr>
             <w:r>
               <w:rPr>
+                <w:rFonts w:cstheme="minorHAnsi"/>
                 <w:b/>
                 <w:bCs/>
                 <w:color w:val="2F5496" w:themeColor="accent1" w:themeShade="BF"/>
@@ -292,125 +248,47 @@
             <w:tcW w:w="8647" w:type="dxa"/>
           </w:tcPr>
           <w:p>
-            <w:pPr>
-              <w:jc w:val="both"/>
-              <w:rPr>
+            <w:r>
+              <w:rPr>
+                <w:rFonts w:cstheme="minorHAnsi"/>
                 <w:b/>
                 <w:bCs/>
                 <w:sz w:val="20"/>
                 <w:szCs w:val="20"/>
-                <w:lang w:val="en-IN"/>
-              </w:rPr>
-            </w:pPr>
-            <w:r>
-              <w:rPr>
-                <w:b/>
-                <w:bCs/>
-                <w:sz w:val="20"/>
-                <w:szCs w:val="20"/>
-                <w:lang w:val="en-IN"/>
-              </w:rPr>
-              <w:t>Master of Business Administration (</w:t>
+              </w:rPr>
+              <w:t>Master of Business Administration (STEM MBA) - University of California, Riverside</w:t>
             </w:r>
             <w:r>
               <w:rPr>
-                <w:b/>
-                <w:bCs/>
-                <w:sz w:val="20"/>
-                <w:szCs w:val="20"/>
-                <w:lang w:val="en-IN"/>
-              </w:rPr>
-              <w:t xml:space="preserve">STEM </w:t>
-            </w:r>
-            <w:r>
-              <w:rPr>
-                <w:b/>
-                <w:bCs/>
-                <w:sz w:val="20"/>
-                <w:szCs w:val="20"/>
-                <w:lang w:val="en-IN"/>
-              </w:rPr>
-              <w:t>MBA) – University of California, Riverside</w:t>
-            </w:r>
-            <w:r>
-              <w:rPr>
+                <w:rFonts w:cstheme="minorHAnsi"/>
                 <w:i/>
                 <w:iCs/>
                 <w:sz w:val="20"/>
                 <w:szCs w:val="20"/>
-                <w:lang w:val="en-IN"/>
-              </w:rPr>
-              <w:t xml:space="preserve"> GPA: 3.8 </w:t>
-            </w:r>
-            <w:r>
-              <w:rPr>
-                <w:i/>
-                <w:iCs/>
-                <w:sz w:val="20"/>
-                <w:szCs w:val="20"/>
-                <w:lang w:val="en-IN"/>
-              </w:rPr>
-              <w:t xml:space="preserve">                                       </w:t>
+              </w:rPr>
+              <w:t xml:space="preserve"> GPA: 3.8</w:t>
             </w:r>
           </w:p>
           <w:p>
-            <w:pPr>
-              <w:jc w:val="both"/>
-              <w:rPr>
-                <w:sz w:val="20"/>
-                <w:szCs w:val="20"/>
-                <w:lang w:val="en-IN"/>
-              </w:rPr>
-            </w:pPr>
             <w:r>
               <w:rPr>
+                <w:rFonts w:cstheme="minorHAnsi"/>
                 <w:b/>
                 <w:bCs/>
                 <w:sz w:val="20"/>
                 <w:szCs w:val="20"/>
-                <w:lang w:val="en-IN"/>
-              </w:rPr>
-              <w:t>Bachelor of Technology, Biotechnology – Vellore Institute of Technology, India</w:t>
+              </w:rPr>
+              <w:t>Bachelor of Technology, Biotechnology - Vellore Institute of Technology, India</w:t>
             </w:r>
             <w:r>
               <w:rPr>
+                <w:rFonts w:cstheme="minorHAnsi"/>
                 <w:i/>
                 <w:iCs/>
                 <w:sz w:val="20"/>
                 <w:szCs w:val="20"/>
-                <w:lang w:val="en-IN"/>
-              </w:rPr>
-              <w:t xml:space="preserve"> </w:t>
-            </w:r>
-            <w:r>
-              <w:rPr>
-                <w:i/>
-                <w:iCs/>
-                <w:sz w:val="20"/>
-                <w:szCs w:val="20"/>
-                <w:lang w:val="en-IN"/>
-              </w:rPr>
-              <w:t xml:space="preserve">GPA:3.5 </w:t>
-            </w:r>
-            <w:r>
-              <w:rPr>
-                <w:i/>
-                <w:iCs/>
-                <w:sz w:val="20"/>
-                <w:szCs w:val="20"/>
-                <w:lang w:val="en-IN"/>
-              </w:rPr>
-              <w:t xml:space="preserve"> </w:t>
-            </w:r>
-            <w:r>
-              <w:rPr>
-                <w:i/>
-                <w:iCs/>
-                <w:sz w:val="20"/>
-                <w:szCs w:val="20"/>
-                <w:lang w:val="en-IN"/>
-              </w:rPr>
-              <w:t xml:space="preserve">                                                   </w:t>
+              </w:rPr>
+              <w:t xml:space="preserve"> GPA: 3.5</w:t>
             </w:r>
           </w:p>
         </w:tc>
@@ -421,21 +299,14 @@
           <w:p>
             <w:pPr>
               <w:jc w:val="right"/>
-              <w:rPr>
+            </w:pPr>
+            <w:r>
+              <w:rPr>
+                <w:rFonts w:cstheme="minorHAnsi"/>
                 <w:b/>
                 <w:bCs/>
                 <w:sz w:val="20"/>
                 <w:szCs w:val="20"/>
-                <w:lang w:val="en-IN"/>
-              </w:rPr>
-            </w:pPr>
-            <w:r>
-              <w:rPr>
-                <w:b/>
-                <w:bCs/>
-                <w:sz w:val="20"/>
-                <w:szCs w:val="20"/>
-                <w:lang w:val="en-IN"/>
               </w:rPr>
               <w:t>June 2026</w:t>
             </w:r>
@@ -443,56 +314,16 @@
           <w:p>
             <w:pPr>
               <w:jc w:val="right"/>
-              <w:rPr>
-                <w:sz w:val="20"/>
-                <w:szCs w:val="20"/>
-                <w:lang w:val="en-IN"/>
-              </w:rPr>
             </w:pPr>
             <w:r>
               <w:rPr>
+                <w:rFonts w:cstheme="minorHAnsi"/>
                 <w:b/>
                 <w:bCs/>
                 <w:sz w:val="20"/>
                 <w:szCs w:val="20"/>
-                <w:lang w:val="en-IN"/>
               </w:rPr>
               <w:t>Aug 2023</w:t>
-            </w:r>
-          </w:p>
-        </w:tc>
-      </w:tr>
-      <w:tr>
-        <w:tc>
-          <w:tcPr>
-            <w:tcW w:w="10466" w:type="dxa"/>
-            <w:gridSpan w:val="2"/>
-            <w:tcBorders>
-              <w:bottom w:val="single" w:sz="4" w:space="0" w:color="auto"/>
-            </w:tcBorders>
-          </w:tcPr>
-          <w:p>
-            <w:pPr>
-              <w:spacing w:before="120"/>
-              <w:jc w:val="both"/>
-              <w:rPr>
-                <w:b/>
-                <w:bCs/>
-                <w:i/>
-                <w:iCs/>
-                <w:sz w:val="20"/>
-                <w:szCs w:val="20"/>
-              </w:rPr>
-            </w:pPr>
-            <w:r>
-              <w:rPr>
-                <w:b/>
-                <w:bCs/>
-                <w:color w:val="2F5496" w:themeColor="accent1" w:themeShade="BF"/>
-                <w:sz w:val="20"/>
-                <w:szCs w:val="20"/>
-              </w:rPr>
-              <w:t xml:space="preserve">SKILLS </w:t>
             </w:r>
           </w:p>
         </w:tc>
@@ -503,120 +334,139 @@
             <w:tcW w:w="0" w:type="auto"/>
             <w:gridSpan w:val="2"/>
             <w:tcBorders>
-              <w:top w:val="single" w:sz="4" w:space="0" w:color="auto"/>
+              <w:bottom w:val="single" w:sz="4" w:space="0" w:color="auto"/>
             </w:tcBorders>
           </w:tcPr>
           <w:p>
             <w:pPr>
-              <w:jc w:val="both"/>
-              <w:rPr>
-                <w:sz w:val="20"/>
-                <w:szCs w:val="20"/>
-                <w:lang w:val="en-IN"/>
+              <w:spacing w:before="120"/>
+              <w:rPr>
+                <w:rFonts w:cstheme="minorHAnsi"/>
+                <w:b/>
+                <w:bCs/>
+                <w:color w:val="2F5496" w:themeColor="accent1" w:themeShade="BF"/>
+                <w:sz w:val="20"/>
+                <w:szCs w:val="20"/>
               </w:rPr>
             </w:pPr>
             <w:r>
               <w:rPr>
+                <w:rFonts w:cstheme="minorHAnsi"/>
                 <w:b/>
                 <w:bCs/>
-                <w:sz w:val="20"/>
-                <w:szCs w:val="20"/>
-                <w:lang w:val="en-IN"/>
-              </w:rPr>
-              <w:t>Sales Strategy &amp; Operations:</w:t>
+                <w:color w:val="2F5496" w:themeColor="accent1" w:themeShade="BF"/>
+                <w:sz w:val="20"/>
+                <w:szCs w:val="20"/>
+              </w:rPr>
+              <w:t>SKILLS</w:t>
+            </w:r>
+          </w:p>
+        </w:tc>
+      </w:tr>
+      <w:tr>
+        <w:tc>
+          <w:tcPr>
+            <w:tcW w:w="0" w:type="auto"/>
+            <w:gridSpan w:val="2"/>
+          </w:tcPr>
+          <w:p>
+            <w:pPr>
+              <w:jc w:val="both"/>
+            </w:pPr>
+            <w:r>
+              <w:rPr>
+                <w:rFonts w:cstheme="minorHAnsi"/>
+                <w:b/>
+                <w:bCs/>
+                <w:sz w:val="20"/>
+                <w:szCs w:val="20"/>
+              </w:rPr>
+              <w:t>Business Strategy:</w:t>
             </w:r>
             <w:r>
               <w:rPr>
-                <w:sz w:val="20"/>
-                <w:szCs w:val="20"/>
-                <w:lang w:val="en-IN"/>
-              </w:rPr>
-              <w:t xml:space="preserve"> Sales Strategy, Business Planning, Go-to-Market Planning, Market &amp; Customer Segmentation, Sales Pipeline Analysis, Business Performance Review, Requirements Gathering, Data Quality &amp; Validation, Stakeholder Management</w:t>
+                <w:rFonts w:cstheme="minorHAnsi"/>
+                <w:sz w:val="20"/>
+                <w:szCs w:val="20"/>
+              </w:rPr>
+              <w:t xml:space="preserve"> Business Strategy, Strategic Planning, Annual Business Planning, Business Case Development, Market Research, Stakeholder Management</w:t>
             </w:r>
           </w:p>
           <w:p>
             <w:pPr>
               <w:jc w:val="both"/>
-              <w:rPr>
-                <w:sz w:val="20"/>
-                <w:szCs w:val="20"/>
-                <w:lang w:val="en-IN"/>
-              </w:rPr>
             </w:pPr>
             <w:r>
               <w:rPr>
+                <w:rFonts w:cstheme="minorHAnsi"/>
                 <w:b/>
                 <w:bCs/>
                 <w:sz w:val="20"/>
                 <w:szCs w:val="20"/>
-                <w:lang w:val="en-IN"/>
-              </w:rPr>
-              <w:t>Analytics &amp; Data:</w:t>
+              </w:rPr>
+              <w:t>Analytics &amp; Reporting:</w:t>
             </w:r>
             <w:r>
               <w:rPr>
-                <w:sz w:val="20"/>
-                <w:szCs w:val="20"/>
-                <w:lang w:val="en-IN"/>
-              </w:rPr>
-              <w:t xml:space="preserve"> SQL, Advanced Excel (Pivot Tables, XLOOKUP, Power Query), Tableau, Qlik Sense, Ad-Hoc Analysis, KPI &amp; Dashboard Development, Statistics &amp; </w:t>
-            </w:r>
-            <w:proofErr w:type="spellStart"/>
-            <w:r>
-              <w:rPr>
-                <w:sz w:val="20"/>
-                <w:szCs w:val="20"/>
-                <w:lang w:val="en-IN"/>
-              </w:rPr>
-              <w:t>Modeling</w:t>
-            </w:r>
-            <w:proofErr w:type="spellEnd"/>
-            <w:r>
-              <w:rPr>
-                <w:sz w:val="20"/>
-                <w:szCs w:val="20"/>
-                <w:lang w:val="en-IN"/>
-              </w:rPr>
-              <w:t xml:space="preserve"> Techniques, Forecasting, Data Visualization</w:t>
+                <w:rFonts w:cstheme="minorHAnsi"/>
+                <w:sz w:val="20"/>
+                <w:szCs w:val="20"/>
+              </w:rPr>
+              <w:t xml:space="preserve"> SQL, Python, Advanced Excel (Pivot Tables, XLOOKUP, Power Query), Tableau, Qlik Sense, KPI Reporting, Data Visualization</w:t>
             </w:r>
           </w:p>
           <w:p>
             <w:pPr>
               <w:jc w:val="both"/>
-              <w:rPr>
-                <w:sz w:val="20"/>
-                <w:szCs w:val="20"/>
-                <w:lang w:val="en-IN"/>
-              </w:rPr>
             </w:pPr>
             <w:r>
               <w:rPr>
+                <w:rFonts w:cstheme="minorHAnsi"/>
                 <w:b/>
                 <w:bCs/>
                 <w:sz w:val="20"/>
                 <w:szCs w:val="20"/>
-                <w:lang w:val="en-IN"/>
+              </w:rPr>
+              <w:t>Operations &amp; Execution:</w:t>
+            </w:r>
+            <w:r>
+              <w:rPr>
+                <w:rFonts w:cstheme="minorHAnsi"/>
+                <w:sz w:val="20"/>
+                <w:szCs w:val="20"/>
+              </w:rPr>
+              <w:t xml:space="preserve"> Cross-Functional Leadership, Program Management, Process Improvement, Operational Excellence, OKR Design &amp; Tracking, Change Management</w:t>
+            </w:r>
+          </w:p>
+          <w:p>
+            <w:pPr>
+              <w:jc w:val="both"/>
+            </w:pPr>
+            <w:r>
+              <w:rPr>
+                <w:rFonts w:cstheme="minorHAnsi"/>
+                <w:b/>
+                <w:bCs/>
+                <w:sz w:val="20"/>
+                <w:szCs w:val="20"/>
               </w:rPr>
               <w:t>Tools &amp; AI:</w:t>
             </w:r>
             <w:r>
               <w:rPr>
-                <w:sz w:val="20"/>
-                <w:szCs w:val="20"/>
-                <w:lang w:val="en-IN"/>
-              </w:rPr>
-              <w:t xml:space="preserve"> Salesforce, PowerPoint, Google Slides, JIRA, SAP Ariba, ChatGPT, Claude, Gemini</w:t>
+                <w:rFonts w:cstheme="minorHAnsi"/>
+                <w:sz w:val="20"/>
+                <w:szCs w:val="20"/>
+              </w:rPr>
+              <w:t xml:space="preserve"> ChatGPT, Claude, Gemini, Excel Copilot, n8n, Salesforce, SAP Ariba, JIRA, HubSpot, PowerPoint</w:t>
             </w:r>
           </w:p>
         </w:tc>
       </w:tr>
       <w:tr>
-        <w:trPr>
-          <w:trHeight w:val="215"/>
-        </w:trPr>
         <w:tc>
           <w:tcPr>
-            <w:tcW w:w="10466" w:type="dxa"/>
+            <w:tcW w:w="0" w:type="auto"/>
             <w:gridSpan w:val="2"/>
             <w:tcBorders>
               <w:bottom w:val="single" w:sz="4" w:space="0" w:color="auto"/>
@@ -625,8 +475,8 @@
           <w:p>
             <w:pPr>
               <w:spacing w:before="120"/>
-              <w:jc w:val="both"/>
-              <w:rPr>
+              <w:rPr>
+                <w:rFonts w:cstheme="minorHAnsi"/>
                 <w:b/>
                 <w:bCs/>
                 <w:color w:val="2F5496" w:themeColor="accent1" w:themeShade="BF"/>
@@ -636,6 +486,7 @@
             </w:pPr>
             <w:r>
               <w:rPr>
+                <w:rFonts w:cstheme="minorHAnsi"/>
                 <w:b/>
                 <w:bCs/>
                 <w:color w:val="2F5496" w:themeColor="accent1" w:themeShade="BF"/>
@@ -643,81 +494,43 @@
                 <w:szCs w:val="20"/>
               </w:rPr>
               <w:t>EXPERIENCE</w:t>
-            </w:r>
-            <w:r>
-              <w:rPr>
-                <w:b/>
-                <w:bCs/>
-                <w:color w:val="2F5496" w:themeColor="accent1" w:themeShade="BF"/>
-                <w:sz w:val="20"/>
-                <w:szCs w:val="20"/>
-              </w:rPr>
-              <w:t xml:space="preserve"> </w:t>
             </w:r>
           </w:p>
         </w:tc>
       </w:tr>
       <w:tr>
-        <w:trPr>
-          <w:trHeight w:val="215"/>
-        </w:trPr>
         <w:tc>
           <w:tcPr>
             <w:tcW w:w="8647" w:type="dxa"/>
-            <w:tcBorders>
-              <w:top w:val="single" w:sz="4" w:space="0" w:color="auto"/>
-            </w:tcBorders>
           </w:tcPr>
           <w:p>
             <w:pPr>
-              <w:jc w:val="both"/>
-              <w:rPr>
+              <w:spacing w:before="120"/>
+            </w:pPr>
+            <w:r>
+              <w:rPr>
+                <w:rFonts w:cstheme="minorHAnsi"/>
                 <w:b/>
                 <w:bCs/>
                 <w:sz w:val="20"/>
                 <w:szCs w:val="20"/>
               </w:rPr>
-            </w:pPr>
-            <w:r>
-              <w:rPr>
-                <w:b/>
-                <w:bCs/>
-                <w:sz w:val="20"/>
-                <w:szCs w:val="20"/>
-              </w:rPr>
-              <w:t>BB Wellness | Analyst– Strategy &amp; Operations</w:t>
-            </w:r>
-            <w:r>
-              <w:rPr>
-                <w:b/>
-                <w:bCs/>
-                <w:sz w:val="20"/>
-                <w:szCs w:val="20"/>
-              </w:rPr>
-              <w:t xml:space="preserve">                           </w:t>
+              <w:t xml:space="preserve">BB Wellness | Analyst </w:t>
             </w:r>
           </w:p>
         </w:tc>
         <w:tc>
           <w:tcPr>
             <w:tcW w:w="1819" w:type="dxa"/>
-            <w:tcBorders>
-              <w:top w:val="single" w:sz="4" w:space="0" w:color="auto"/>
-            </w:tcBorders>
           </w:tcPr>
           <w:p>
             <w:pPr>
+              <w:spacing w:before="120"/>
               <w:jc w:val="right"/>
-              <w:rPr>
-                <w:b/>
-                <w:bCs/>
-                <w:color w:val="2F5496" w:themeColor="accent1" w:themeShade="BF"/>
-                <w:sz w:val="20"/>
-                <w:szCs w:val="20"/>
-              </w:rPr>
             </w:pPr>
             <w:r>
               <w:rPr>
+                <w:rFonts w:cstheme="minorHAnsi"/>
                 <w:b/>
                 <w:bCs/>
                 <w:sz w:val="20"/>
@@ -743,16 +556,18 @@
               </w:numPr>
               <w:jc w:val="both"/>
               <w:rPr>
+                <w:rFonts w:cstheme="minorHAnsi"/>
                 <w:sz w:val="20"/>
                 <w:szCs w:val="20"/>
               </w:rPr>
             </w:pPr>
             <w:r>
               <w:rPr>
-                <w:sz w:val="20"/>
-                <w:szCs w:val="20"/>
-              </w:rPr>
-              <w:t>Conducted market segmentation and competitive benchmarking across 20+ competitors, uncovering white-space opportunities that informed go-to-market planning and business recommendations for leadership.</w:t>
+                <w:rFonts w:cstheme="minorHAnsi"/>
+                <w:sz w:val="20"/>
+                <w:szCs w:val="20"/>
+              </w:rPr>
+              <w:t>Defined go-to-market problem scope through market segmentation and competitive benchmarking across 6 competitors, translating research into fact-based product positioning recommendations for leadership.</w:t>
             </w:r>
           </w:p>
           <w:p>
@@ -764,16 +579,18 @@
               </w:numPr>
               <w:jc w:val="both"/>
               <w:rPr>
+                <w:rFonts w:cstheme="minorHAnsi"/>
                 <w:sz w:val="20"/>
                 <w:szCs w:val="20"/>
               </w:rPr>
             </w:pPr>
             <w:r>
               <w:rPr>
-                <w:sz w:val="20"/>
-                <w:szCs w:val="20"/>
-              </w:rPr>
-              <w:t>Built SQL-driven KPI dashboards tracking sales pipeline, campaign performance, and business performance metrics across 4 channels, giving leadership a single source of truth for business performance reviews.</w:t>
+                <w:rFonts w:cstheme="minorHAnsi"/>
+                <w:sz w:val="20"/>
+                <w:szCs w:val="20"/>
+              </w:rPr>
+              <w:t>Built SQL-driven KPI dashboards spanning 4 channels, establishing a centralized reporting framework that surfaced performance gaps and enabled leadership to prioritize strategic initiatives.</w:t>
             </w:r>
           </w:p>
           <w:p>
@@ -783,19 +600,20 @@
                 <w:ilvl w:val="0"/>
                 <w:numId w:val="27"/>
               </w:numPr>
-              <w:spacing w:before="120"/>
               <w:jc w:val="both"/>
               <w:rPr>
+                <w:rFonts w:cstheme="minorHAnsi"/>
                 <w:sz w:val="20"/>
                 <w:szCs w:val="20"/>
               </w:rPr>
             </w:pPr>
             <w:r>
               <w:rPr>
-                <w:sz w:val="20"/>
-                <w:szCs w:val="20"/>
-              </w:rPr>
-              <w:t>Owned end-to-end delivery of cross-functional projects spanning leadership, interns, and external stakeholders, maintaining 95%+ on-time completion across multiple concurrent workstreams.</w:t>
+                <w:rFonts w:cstheme="minorHAnsi"/>
+                <w:sz w:val="20"/>
+                <w:szCs w:val="20"/>
+              </w:rPr>
+              <w:t>Developed hypothesis-driven business cases and strategic roadmaps, partnering with marketing, content, and operations stakeholders to align 10+ cross-functional initiatives against weekly OKRs.</w:t>
             </w:r>
           </w:p>
         </w:tc>
@@ -807,28 +625,17 @@
           </w:tcPr>
           <w:p>
             <w:pPr>
-              <w:keepNext/>
-              <w:keepLines/>
-              <w:tabs>
-                <w:tab w:val="left" w:pos="1184"/>
-              </w:tabs>
               <w:spacing w:before="120"/>
-              <w:jc w:val="both"/>
-              <w:rPr>
+            </w:pPr>
+            <w:r>
+              <w:rPr>
+                <w:rFonts w:cstheme="minorHAnsi"/>
                 <w:b/>
                 <w:bCs/>
                 <w:sz w:val="20"/>
                 <w:szCs w:val="20"/>
               </w:rPr>
-            </w:pPr>
-            <w:r>
-              <w:rPr>
-                <w:b/>
-                <w:bCs/>
-                <w:sz w:val="20"/>
-                <w:szCs w:val="20"/>
-              </w:rPr>
-              <w:t>Thomson Reuters | Analyst – Global Operations &amp; Strategy</w:t>
+              <w:t>Thomson Reuters | Analyst – Global Operations</w:t>
             </w:r>
           </w:p>
         </w:tc>
@@ -838,22 +645,12 @@
           </w:tcPr>
           <w:p>
             <w:pPr>
-              <w:keepNext/>
-              <w:keepLines/>
-              <w:tabs>
-                <w:tab w:val="left" w:pos="1184"/>
-              </w:tabs>
               <w:spacing w:before="120"/>
-              <w:jc w:val="both"/>
-              <w:rPr>
-                <w:b/>
-                <w:bCs/>
-                <w:sz w:val="20"/>
-                <w:szCs w:val="20"/>
-              </w:rPr>
+              <w:jc w:val="right"/>
             </w:pPr>
             <w:r>
               <w:rPr>
+                <w:rFonts w:cstheme="minorHAnsi"/>
                 <w:b/>
                 <w:bCs/>
                 <w:sz w:val="20"/>
@@ -879,16 +676,18 @@
               </w:numPr>
               <w:jc w:val="both"/>
               <w:rPr>
+                <w:rFonts w:cstheme="minorHAnsi"/>
                 <w:sz w:val="20"/>
                 <w:szCs w:val="20"/>
               </w:rPr>
             </w:pPr>
             <w:r>
               <w:rPr>
-                <w:sz w:val="20"/>
-                <w:szCs w:val="20"/>
-              </w:rPr>
-              <w:t>Built SQL and Excel-based reporting frameworks used by 60+ stakeholders, creating a scalable reporting infrastructure that surfaced operational and financial KPIs for leadership planning and resource allocation.</w:t>
+                <w:rFonts w:cstheme="minorHAnsi"/>
+                <w:sz w:val="20"/>
+                <w:szCs w:val="20"/>
+              </w:rPr>
+              <w:t>Built 15+ SQL and Excel reporting frameworks adopted across 3 global business units, reducing manual reporting effort ~30% and improving executive visibility into business performance.</w:t>
             </w:r>
           </w:p>
           <w:p>
@@ -900,16 +699,18 @@
               </w:numPr>
               <w:jc w:val="both"/>
               <w:rPr>
+                <w:rFonts w:cstheme="minorHAnsi"/>
                 <w:sz w:val="20"/>
                 <w:szCs w:val="20"/>
               </w:rPr>
             </w:pPr>
             <w:r>
               <w:rPr>
-                <w:sz w:val="20"/>
-                <w:szCs w:val="20"/>
-              </w:rPr>
-              <w:t>Gathered reporting requirements from finance and procurement stakeholders across 4 regions, standardizing KPIs and validating data quality across business reports.</w:t>
+                <w:rFonts w:cstheme="minorHAnsi"/>
+                <w:sz w:val="20"/>
+                <w:szCs w:val="20"/>
+              </w:rPr>
+              <w:t>Partnered with finance, procurement, and operations stakeholders across 4 regions to standardize KPIs and support Quarterly Business Reviews, budgeting, and annual business planning.</w:t>
             </w:r>
           </w:p>
           <w:p>
@@ -919,26 +720,20 @@
                 <w:ilvl w:val="0"/>
                 <w:numId w:val="27"/>
               </w:numPr>
-              <w:spacing w:before="120"/>
               <w:jc w:val="both"/>
               <w:rPr>
+                <w:rFonts w:cstheme="minorHAnsi"/>
                 <w:sz w:val="20"/>
                 <w:szCs w:val="20"/>
               </w:rPr>
             </w:pPr>
             <w:r>
               <w:rPr>
-                <w:sz w:val="20"/>
-                <w:szCs w:val="20"/>
-              </w:rPr>
-              <w:t>Conducted</w:t>
-            </w:r>
-            <w:r>
-              <w:rPr>
-                <w:sz w:val="20"/>
-                <w:szCs w:val="20"/>
-              </w:rPr>
-              <w:t xml:space="preserve"> root cause analysis on cross-functional reporting discrepancies and developed executive presentations used in quarterly business reviews and leadership planning discussions.</w:t>
+                <w:rFonts w:cstheme="minorHAnsi"/>
+                <w:sz w:val="20"/>
+                <w:szCs w:val="20"/>
+              </w:rPr>
+              <w:t>Prepared executive summaries translating complex, multi-source analyses into structured business recommendations for senior leadership.</w:t>
             </w:r>
           </w:p>
         </w:tc>
@@ -951,49 +746,16 @@
           <w:p>
             <w:pPr>
               <w:spacing w:before="120"/>
-              <w:jc w:val="both"/>
-              <w:rPr>
-                <w:sz w:val="20"/>
-                <w:szCs w:val="20"/>
-              </w:rPr>
             </w:pPr>
             <w:r>
               <w:rPr>
+                <w:rFonts w:cstheme="minorHAnsi"/>
                 <w:b/>
                 <w:bCs/>
                 <w:sz w:val="20"/>
                 <w:szCs w:val="20"/>
               </w:rPr>
-              <w:t>Goldm</w:t>
-            </w:r>
-            <w:r>
-              <w:rPr>
-                <w:b/>
-                <w:bCs/>
-                <w:sz w:val="20"/>
-                <w:szCs w:val="20"/>
-              </w:rPr>
-              <w:t>a</w:t>
-            </w:r>
-            <w:r>
-              <w:rPr>
-                <w:b/>
-                <w:bCs/>
-                <w:sz w:val="20"/>
-                <w:szCs w:val="20"/>
-              </w:rPr>
-              <w:t>n Sachs | STEM Intern – Asset &amp; Wealth Management</w:t>
-            </w:r>
-            <w:r>
-              <w:rPr>
-                <w:b/>
-                <w:bCs/>
-                <w:i/>
-                <w:iCs/>
-                <w:sz w:val="20"/>
-                <w:szCs w:val="20"/>
-              </w:rPr>
-              <w:tab/>
+              <w:t>Goldman Sachs | STEM Intern – Asset &amp; Wealth Management</w:t>
             </w:r>
           </w:p>
         </w:tc>
@@ -1004,23 +766,11 @@
           <w:p>
             <w:pPr>
               <w:spacing w:before="120"/>
-              <w:jc w:val="both"/>
-              <w:rPr>
-                <w:sz w:val="20"/>
-                <w:szCs w:val="20"/>
-              </w:rPr>
+              <w:jc w:val="right"/>
             </w:pPr>
             <w:r>
               <w:rPr>
-                <w:b/>
-                <w:bCs/>
-                <w:sz w:val="20"/>
-                <w:szCs w:val="20"/>
-              </w:rPr>
-              <w:t xml:space="preserve">   </w:t>
-            </w:r>
-            <w:r>
-              <w:rPr>
+                <w:rFonts w:cstheme="minorHAnsi"/>
                 <w:b/>
                 <w:bCs/>
                 <w:sz w:val="20"/>
@@ -1046,16 +796,18 @@
               </w:numPr>
               <w:jc w:val="both"/>
               <w:rPr>
+                <w:rFonts w:cstheme="minorHAnsi"/>
                 <w:sz w:val="20"/>
                 <w:szCs w:val="20"/>
               </w:rPr>
             </w:pPr>
             <w:r>
               <w:rPr>
-                <w:sz w:val="20"/>
-                <w:szCs w:val="20"/>
-              </w:rPr>
-              <w:t>Analyzed reporting workflows across Client Revenue Operations and Institutional Client Reporting teams, identifying gaps and automation opportunities that improved operational visibility.</w:t>
+                <w:rFonts w:cstheme="minorHAnsi"/>
+                <w:sz w:val="20"/>
+                <w:szCs w:val="20"/>
+              </w:rPr>
+              <w:t>Built Qlik Sense dashboards consolidating 5+ operational data sources, improving executive visibility into business performance across AWM.</w:t>
             </w:r>
           </w:p>
           <w:p>
@@ -1067,16 +819,18 @@
               </w:numPr>
               <w:jc w:val="both"/>
               <w:rPr>
+                <w:rFonts w:cstheme="minorHAnsi"/>
                 <w:sz w:val="20"/>
                 <w:szCs w:val="20"/>
               </w:rPr>
             </w:pPr>
             <w:r>
               <w:rPr>
-                <w:sz w:val="20"/>
-                <w:szCs w:val="20"/>
-              </w:rPr>
-              <w:t>Built reporting trackers and dashboards (Excel, Qlik Sense, JIRA) monitoring 500+ client commitments, strengthening governance and issue tracking.</w:t>
+                <w:rFonts w:cstheme="minorHAnsi"/>
+                <w:sz w:val="20"/>
+                <w:szCs w:val="20"/>
+              </w:rPr>
+              <w:t>Identified process gaps through workflow analysis using Excel, JIRA, and Qlik Sense, strengthening compliance reporting and operational controls.</w:t>
             </w:r>
           </w:p>
           <w:p>
@@ -1088,16 +842,18 @@
               </w:numPr>
               <w:jc w:val="both"/>
               <w:rPr>
+                <w:rFonts w:cstheme="minorHAnsi"/>
                 <w:sz w:val="20"/>
                 <w:szCs w:val="20"/>
               </w:rPr>
             </w:pPr>
             <w:r>
               <w:rPr>
-                <w:sz w:val="20"/>
-                <w:szCs w:val="20"/>
-              </w:rPr>
-              <w:t>Presented structured findings and process improvement recommendations to senior stakeholders in presentations.</w:t>
+                <w:rFonts w:cstheme="minorHAnsi"/>
+                <w:sz w:val="20"/>
+                <w:szCs w:val="20"/>
+              </w:rPr>
+              <w:t>Developed operational trackers monitoring hundreds of client commitments, improving workflow transparency and cross-team reporting consistency.</w:t>
             </w:r>
           </w:p>
         </w:tc>
@@ -1110,14 +866,10 @@
           <w:p>
             <w:pPr>
               <w:spacing w:before="120"/>
-              <w:jc w:val="both"/>
-              <w:rPr>
-                <w:sz w:val="20"/>
-                <w:szCs w:val="20"/>
-              </w:rPr>
             </w:pPr>
             <w:r>
               <w:rPr>
+                <w:rFonts w:cstheme="minorHAnsi"/>
                 <w:b/>
                 <w:bCs/>
                 <w:sz w:val="20"/>
@@ -1135,13 +887,10 @@
             <w:pPr>
               <w:spacing w:before="120"/>
               <w:jc w:val="right"/>
-              <w:rPr>
-                <w:sz w:val="20"/>
-                <w:szCs w:val="20"/>
-              </w:rPr>
             </w:pPr>
             <w:r>
               <w:rPr>
+                <w:rFonts w:cstheme="minorHAnsi"/>
                 <w:b/>
                 <w:bCs/>
                 <w:sz w:val="20"/>
@@ -1167,16 +916,18 @@
               </w:numPr>
               <w:jc w:val="both"/>
               <w:rPr>
+                <w:rFonts w:cstheme="minorHAnsi"/>
                 <w:sz w:val="20"/>
                 <w:szCs w:val="20"/>
               </w:rPr>
             </w:pPr>
             <w:r>
               <w:rPr>
-                <w:sz w:val="20"/>
-                <w:szCs w:val="20"/>
-              </w:rPr>
-              <w:t>Used SQL, Python, and Tableau to analyze healthcare client datasets, building automated dashboards that improved real-time visibility into KPIs and performance trends.</w:t>
+                <w:rFonts w:cstheme="minorHAnsi"/>
+                <w:sz w:val="20"/>
+                <w:szCs w:val="20"/>
+              </w:rPr>
+              <w:t>Analyzed business datasets using SQL, Python, and Excel; built Tableau dashboards enabling real-time performance monitoring for healthcare clients.</w:t>
             </w:r>
           </w:p>
         </w:tc>
@@ -1193,15 +944,18 @@
           <w:p>
             <w:pPr>
               <w:spacing w:before="120"/>
-              <w:jc w:val="both"/>
-              <w:rPr>
-                <w:rStyle w:val="IntenseReference"/>
+              <w:rPr>
+                <w:rFonts w:cstheme="minorHAnsi"/>
+                <w:b/>
+                <w:bCs/>
+                <w:color w:val="2F5496" w:themeColor="accent1" w:themeShade="BF"/>
                 <w:sz w:val="20"/>
                 <w:szCs w:val="20"/>
               </w:rPr>
             </w:pPr>
             <w:r>
               <w:rPr>
+                <w:rFonts w:cstheme="minorHAnsi"/>
                 <w:b/>
                 <w:bCs/>
                 <w:color w:val="2F5496" w:themeColor="accent1" w:themeShade="BF"/>
@@ -1220,14 +974,6 @@
             <w:gridSpan w:val="2"/>
           </w:tcPr>
           <w:p>
-            <w:pPr>
-              <w:jc w:val="both"/>
-              <w:rPr>
-                <w:rFonts w:cstheme="minorHAnsi"/>
-                <w:sz w:val="20"/>
-                <w:szCs w:val="20"/>
-              </w:rPr>
-            </w:pPr>
             <w:r>
               <w:rPr>
                 <w:rFonts w:cstheme="minorHAnsi"/>
@@ -1236,7 +982,7 @@
                 <w:sz w:val="20"/>
                 <w:szCs w:val="20"/>
               </w:rPr>
-              <w:t xml:space="preserve">Hyundai Rotem Operations Consulting Project </w:t>
+              <w:t>Hyundai Rotem Operations Consulting Project</w:t>
             </w:r>
           </w:p>
           <w:p>
@@ -1248,66 +994,47 @@
               </w:numPr>
               <w:jc w:val="both"/>
               <w:rPr>
+                <w:rFonts w:cstheme="minorHAnsi"/>
                 <w:sz w:val="20"/>
                 <w:szCs w:val="20"/>
               </w:rPr>
             </w:pPr>
             <w:r>
               <w:rPr>
-                <w:sz w:val="20"/>
-                <w:szCs w:val="20"/>
-              </w:rPr>
-              <w:t>Analyzed manufacturing workflows and capacity constraints through process mapping, assessments, and stakeholder interviews, applying a structured, logical approach to ambiguous problems.</w:t>
+                <w:rFonts w:cstheme="minorHAnsi"/>
+                <w:sz w:val="20"/>
+                <w:szCs w:val="20"/>
+              </w:rPr>
+              <w:t>Led a strategy consulting engagement analyzing manufacturing operations, inventory flows, and capacity constraints through process mapping and stakeholder interviews.</w:t>
             </w:r>
           </w:p>
           <w:p>
             <w:pPr>
-              <w:keepNext/>
-              <w:keepLines/>
+              <w:pStyle w:val="ListParagraph"/>
               <w:numPr>
                 <w:ilvl w:val="0"/>
                 <w:numId w:val="27"/>
               </w:numPr>
               <w:jc w:val="both"/>
               <w:rPr>
+                <w:rFonts w:cstheme="minorHAnsi"/>
                 <w:sz w:val="20"/>
                 <w:szCs w:val="20"/>
               </w:rPr>
             </w:pPr>
             <w:r>
               <w:rPr>
-                <w:sz w:val="20"/>
-                <w:szCs w:val="20"/>
-              </w:rPr>
-              <w:t>Developed KPI tracking frameworks and presented phased, data-driven recommendations that improved throughput and operational visibility.</w:t>
+                <w:rFonts w:cstheme="minorHAnsi"/>
+                <w:sz w:val="20"/>
+                <w:szCs w:val="20"/>
+              </w:rPr>
+              <w:t>Developed phased operational roadmaps, KPI frameworks, and executive recommendations improving scalability and operational efficiency.</w:t>
             </w:r>
           </w:p>
           <w:p>
-            <w:pPr>
-              <w:keepNext/>
-              <w:keepLines/>
-              <w:ind w:left="200"/>
-              <w:jc w:val="both"/>
-              <w:rPr>
-                <w:sz w:val="10"/>
-                <w:szCs w:val="10"/>
-              </w:rPr>
-            </w:pPr>
-          </w:p>
-          <w:p>
-            <w:pPr>
-              <w:keepNext/>
-              <w:keepLines/>
-              <w:jc w:val="both"/>
-              <w:rPr>
-                <w:b/>
-                <w:bCs/>
-                <w:sz w:val="20"/>
-                <w:szCs w:val="20"/>
-              </w:rPr>
-            </w:pPr>
             <w:r>
               <w:rPr>
+                <w:rFonts w:cstheme="minorHAnsi"/>
                 <w:b/>
                 <w:bCs/>
                 <w:sz w:val="20"/>
@@ -1325,38 +1052,23 @@
               </w:numPr>
               <w:jc w:val="both"/>
               <w:rPr>
+                <w:rFonts w:cstheme="minorHAnsi"/>
                 <w:sz w:val="20"/>
                 <w:szCs w:val="20"/>
               </w:rPr>
             </w:pPr>
             <w:r>
               <w:rPr>
-                <w:sz w:val="20"/>
-                <w:szCs w:val="20"/>
-              </w:rPr>
-              <w:t xml:space="preserve">Led team of </w:t>
-            </w:r>
-            <w:r>
-              <w:rPr>
-                <w:sz w:val="20"/>
-                <w:szCs w:val="20"/>
-              </w:rPr>
-              <w:t>19</w:t>
-            </w:r>
-            <w:r>
-              <w:rPr>
-                <w:sz w:val="20"/>
-                <w:szCs w:val="20"/>
-              </w:rPr>
-              <w:t xml:space="preserve"> people and launched the school’s first newsletter and podcast, designing editorial strategy and performance dashboards that improved audience engagement.</w:t>
+                <w:rFonts w:cstheme="minorHAnsi"/>
+                <w:sz w:val="20"/>
+                <w:szCs w:val="20"/>
+              </w:rPr>
+              <w:t>Launched the school's first newsletter and podcast, designing editorial strategy, distribution workflows, and performance dashboards that improved audience engagement.</w:t>
             </w:r>
           </w:p>
         </w:tc>
       </w:tr>
       <w:tr>
-        <w:trPr>
-          <w:trHeight w:val="266"/>
-        </w:trPr>
         <w:tc>
           <w:tcPr>
             <w:tcW w:w="0" w:type="auto"/>
@@ -1368,20 +1080,20 @@
           <w:p>
             <w:pPr>
               <w:spacing w:before="120"/>
-              <w:jc w:val="both"/>
-              <w:rPr>
-                <w:rStyle w:val="IntenseReference"/>
-                <w:b w:val="0"/>
-                <w:bCs w:val="0"/>
+              <w:rPr>
+                <w:rFonts w:cstheme="minorHAnsi"/>
+                <w:b/>
+                <w:bCs/>
+                <w:color w:val="2F5496" w:themeColor="accent1" w:themeShade="BF"/>
                 <w:sz w:val="20"/>
                 <w:szCs w:val="20"/>
               </w:rPr>
             </w:pPr>
             <w:r>
               <w:rPr>
+                <w:rFonts w:cstheme="minorHAnsi"/>
                 <w:b/>
                 <w:bCs/>
-                <w:smallCaps/>
                 <w:color w:val="2F5496" w:themeColor="accent1" w:themeShade="BF"/>
                 <w:sz w:val="20"/>
                 <w:szCs w:val="20"/>
@@ -1396,9 +1108,6 @@
           <w:tcPr>
             <w:tcW w:w="0" w:type="auto"/>
             <w:gridSpan w:val="2"/>
-            <w:tcBorders>
-              <w:top w:val="single" w:sz="4" w:space="0" w:color="auto"/>
-            </w:tcBorders>
           </w:tcPr>
           <w:p>
             <w:pPr>
@@ -1409,12 +1118,14 @@
               </w:numPr>
               <w:jc w:val="both"/>
               <w:rPr>
+                <w:rFonts w:cstheme="minorHAnsi"/>
                 <w:sz w:val="20"/>
                 <w:szCs w:val="20"/>
               </w:rPr>
             </w:pPr>
             <w:r>
               <w:rPr>
+                <w:rFonts w:cstheme="minorHAnsi"/>
                 <w:sz w:val="20"/>
                 <w:szCs w:val="20"/>
               </w:rPr>
@@ -1428,15 +1139,16 @@
                 <w:ilvl w:val="0"/>
                 <w:numId w:val="27"/>
               </w:numPr>
-              <w:spacing w:before="120"/>
               <w:jc w:val="both"/>
               <w:rPr>
+                <w:rFonts w:cstheme="minorHAnsi"/>
                 <w:sz w:val="20"/>
                 <w:szCs w:val="20"/>
               </w:rPr>
             </w:pPr>
             <w:r>
               <w:rPr>
+                <w:rFonts w:cstheme="minorHAnsi"/>
                 <w:sz w:val="20"/>
                 <w:szCs w:val="20"/>
               </w:rPr>
@@ -1450,40 +1162,20 @@
                 <w:ilvl w:val="0"/>
                 <w:numId w:val="27"/>
               </w:numPr>
-              <w:spacing w:before="120"/>
               <w:jc w:val="both"/>
               <w:rPr>
+                <w:rFonts w:cstheme="minorHAnsi"/>
                 <w:sz w:val="20"/>
                 <w:szCs w:val="20"/>
               </w:rPr>
             </w:pPr>
             <w:r>
               <w:rPr>
-                <w:sz w:val="20"/>
-                <w:szCs w:val="20"/>
-              </w:rPr>
-              <w:t xml:space="preserve">Award for </w:t>
-            </w:r>
-            <w:r>
-              <w:rPr>
-                <w:sz w:val="20"/>
-                <w:szCs w:val="20"/>
-              </w:rPr>
-              <w:t>B</w:t>
-            </w:r>
-            <w:r>
-              <w:rPr>
-                <w:sz w:val="20"/>
-                <w:szCs w:val="20"/>
-              </w:rPr>
-              <w:t>est G</w:t>
-            </w:r>
-            <w:r>
-              <w:rPr>
-                <w:sz w:val="20"/>
-                <w:szCs w:val="20"/>
-              </w:rPr>
-              <w:t>raduate Teaching Assistant, Statistics</w:t>
+                <w:rFonts w:cstheme="minorHAnsi"/>
+                <w:sz w:val="20"/>
+                <w:szCs w:val="20"/>
+              </w:rPr>
+              <w:t>Award for Best Graduate Teaching Assistant, Statistics</w:t>
             </w:r>
           </w:p>
           <w:p>
@@ -1493,15 +1185,16 @@
                 <w:ilvl w:val="0"/>
                 <w:numId w:val="27"/>
               </w:numPr>
-              <w:spacing w:before="120"/>
               <w:jc w:val="both"/>
               <w:rPr>
+                <w:rFonts w:cstheme="minorHAnsi"/>
                 <w:sz w:val="20"/>
                 <w:szCs w:val="20"/>
               </w:rPr>
             </w:pPr>
             <w:r>
               <w:rPr>
+                <w:rFonts w:cstheme="minorHAnsi"/>
                 <w:sz w:val="20"/>
                 <w:szCs w:val="20"/>
               </w:rPr>

</xml_diff>

<commit_message>
Upgrade v1 resume tailoring catalog
</commit_message>
<xml_diff>
--- a/resume_engine/new_template.docx
+++ b/resume_engine/new_template.docx
@@ -18,8 +18,8 @@
         <w:tblLook w:val="04A0" w:firstRow="1" w:lastRow="0" w:firstColumn="1" w:lastColumn="0" w:noHBand="0" w:noVBand="1"/>
       </w:tblPr>
       <w:tblGrid>
-        <w:gridCol w:w="8477"/>
-        <w:gridCol w:w="1989"/>
+        <w:gridCol w:w="7986"/>
+        <w:gridCol w:w="2480"/>
       </w:tblGrid>
       <w:tr>
         <w:tc>
@@ -30,6 +30,11 @@
           <w:p>
             <w:pPr>
               <w:jc w:val="center"/>
+              <w:rPr>
+                <w:rFonts w:cstheme="minorHAnsi"/>
+                <w:sz w:val="32"/>
+                <w:szCs w:val="32"/>
+              </w:rPr>
             </w:pPr>
             <w:r>
               <w:rPr>
@@ -51,24 +56,62 @@
           </w:tcPr>
           <w:p>
             <w:pPr>
-              <w:spacing w:before="60" w:after="60"/>
+              <w:spacing w:before="60"/>
               <w:jc w:val="center"/>
             </w:pPr>
             <w:r>
               <w:rPr>
                 <w:rFonts w:cstheme="minorHAnsi"/>
-                <w:sz w:val="20"/>
-                <w:szCs w:val="20"/>
-              </w:rPr>
-              <w:t xml:space="preserve">+1 (951)-347-5278 | </w:t>
+              </w:rPr>
+              <w:t xml:space="preserve">+1 </w:t>
+            </w:r>
+            <w:r>
+              <w:rPr>
+                <w:rFonts w:cstheme="minorHAnsi"/>
+              </w:rPr>
+              <w:t>(</w:t>
+            </w:r>
+            <w:r>
+              <w:rPr>
+                <w:rFonts w:cstheme="minorHAnsi"/>
+              </w:rPr>
+              <w:t>951</w:t>
+            </w:r>
+            <w:r>
+              <w:rPr>
+                <w:rFonts w:cstheme="minorHAnsi"/>
+              </w:rPr>
+              <w:t>)</w:t>
+            </w:r>
+            <w:r>
+              <w:rPr>
+                <w:rFonts w:cstheme="minorHAnsi"/>
+              </w:rPr>
+              <w:t>-</w:t>
+            </w:r>
+            <w:r>
+              <w:rPr>
+                <w:rFonts w:cstheme="minorHAnsi"/>
+              </w:rPr>
+              <w:t>347-</w:t>
+            </w:r>
+            <w:r>
+              <w:rPr>
+                <w:rFonts w:cstheme="minorHAnsi"/>
+              </w:rPr>
+              <w:t>5278</w:t>
+            </w:r>
+            <w:r>
+              <w:rPr>
+                <w:rFonts w:cstheme="minorHAnsi"/>
+              </w:rPr>
+              <w:t xml:space="preserve"> | </w:t>
             </w:r>
             <w:hyperlink r:id="rId6" w:history="1">
               <w:r>
                 <w:rPr>
                   <w:rStyle w:val="Hyperlink"/>
                   <w:rFonts w:cstheme="minorHAnsi"/>
-                  <w:sz w:val="20"/>
-                  <w:szCs w:val="20"/>
                 </w:rPr>
                 <w:t>shrujalag.gms@gmail.com</w:t>
               </w:r>
@@ -76,76 +119,56 @@
             <w:r>
               <w:rPr>
                 <w:rFonts w:cstheme="minorHAnsi"/>
-                <w:sz w:val="20"/>
-                <w:szCs w:val="20"/>
-              </w:rPr>
-              <w:t xml:space="preserve"> | </w:t>
-            </w:r>
-            <w:hyperlink r:id="rId7" w:history="1">
+              </w:rPr>
+              <w:t xml:space="preserve"> |</w:t>
+            </w:r>
+            <w:r>
+              <w:rPr>
+                <w:rFonts w:cstheme="minorHAnsi"/>
+              </w:rPr>
+              <w:t xml:space="preserve"> </w:t>
+            </w:r>
+            <w:hyperlink r:id="rId7" w:tgtFrame="_blank" w:history="1">
               <w:r>
                 <w:rPr>
                   <w:rStyle w:val="Hyperlink"/>
                   <w:rFonts w:cstheme="minorHAnsi"/>
-                  <w:sz w:val="20"/>
-                  <w:szCs w:val="20"/>
                 </w:rPr>
                 <w:t>LinkedIn</w:t>
               </w:r>
             </w:hyperlink>
             <w:r>
-              <w:rPr>
-                <w:rFonts w:cstheme="minorHAnsi"/>
-                <w:sz w:val="20"/>
-                <w:szCs w:val="20"/>
-              </w:rPr>
-              <w:t xml:space="preserve"> | </w:t>
+              <w:t xml:space="preserve">| </w:t>
             </w:r>
             <w:hyperlink r:id="rId8" w:history="1">
               <w:r>
                 <w:rPr>
                   <w:rStyle w:val="Hyperlink"/>
-                  <w:rFonts w:cstheme="minorHAnsi"/>
-                  <w:sz w:val="20"/>
-                  <w:szCs w:val="20"/>
                 </w:rPr>
-                <w:t>Port</w:t>
+                <w:t>Portfolio</w:t>
+              </w:r>
+            </w:hyperlink>
+            <w:r>
+              <w:t xml:space="preserve"> | </w:t>
+            </w:r>
+            <w:hyperlink r:id="rId9" w:history="1">
+              <w:r>
+                <w:rPr>
+                  <w:rStyle w:val="Hyperlink"/>
+                </w:rPr>
+                <w:t>Git</w:t>
               </w:r>
               <w:r>
                 <w:rPr>
                   <w:rStyle w:val="Hyperlink"/>
-                  <w:rFonts w:cstheme="minorHAnsi"/>
-                  <w:sz w:val="20"/>
-                  <w:szCs w:val="20"/>
                 </w:rPr>
-                <w:t>f</w:t>
+                <w:t>H</w:t>
               </w:r>
               <w:r>
                 <w:rPr>
                   <w:rStyle w:val="Hyperlink"/>
-                  <w:rFonts w:cstheme="minorHAnsi"/>
-                  <w:sz w:val="20"/>
-                  <w:szCs w:val="20"/>
                 </w:rPr>
-                <w:t>olio</w:t>
-              </w:r>
-            </w:hyperlink>
-            <w:r>
-              <w:rPr>
-                <w:rFonts w:cstheme="minorHAnsi"/>
-                <w:sz w:val="20"/>
-                <w:szCs w:val="20"/>
-              </w:rPr>
-              <w:t xml:space="preserve"> | </w:t>
-            </w:r>
-            <w:hyperlink r:id="rId9" w:history="1">
-              <w:r>
-                <w:rPr>
-                  <w:rStyle w:val="Hyperlink"/>
-                  <w:rFonts w:cstheme="minorHAnsi"/>
-                  <w:sz w:val="20"/>
-                  <w:szCs w:val="20"/>
-                </w:rPr>
-                <w:t>GitHub</w:t>
+                <w:t>ub</w:t>
               </w:r>
             </w:hyperlink>
           </w:p>
@@ -162,19 +185,18 @@
           </w:tcPr>
           <w:p>
             <w:pPr>
-              <w:spacing w:before="60"/>
+              <w:spacing w:before="240"/>
+              <w:jc w:val="both"/>
               <w:rPr>
                 <w:rFonts w:cstheme="minorHAnsi"/>
                 <w:b/>
                 <w:bCs/>
-                <w:color w:val="2F5496" w:themeColor="accent1" w:themeShade="BF"/>
                 <w:sz w:val="20"/>
                 <w:szCs w:val="20"/>
               </w:rPr>
             </w:pPr>
             <w:r>
               <w:rPr>
-                <w:rFonts w:cstheme="minorHAnsi"/>
                 <w:b/>
                 <w:bCs/>
                 <w:color w:val="2F5496" w:themeColor="accent1" w:themeShade="BF"/>
@@ -182,6 +204,16 @@
                 <w:szCs w:val="20"/>
               </w:rPr>
               <w:t>PROFESSIONAL SUMMARY</w:t>
+            </w:r>
+            <w:r>
+              <w:rPr>
+                <w:b/>
+                <w:bCs/>
+                <w:color w:val="2F5496" w:themeColor="accent1" w:themeShade="BF"/>
+                <w:sz w:val="20"/>
+                <w:szCs w:val="20"/>
+              </w:rPr>
+              <w:t xml:space="preserve"> </w:t>
             </w:r>
           </w:p>
         </w:tc>
@@ -195,6 +227,12 @@
           <w:p>
             <w:pPr>
               <w:jc w:val="both"/>
+              <w:rPr>
+                <w:rFonts w:cstheme="minorHAnsi"/>
+                <w:sz w:val="20"/>
+                <w:szCs w:val="20"/>
+                <w:lang w:val="en-IN"/>
+              </w:rPr>
             </w:pPr>
             <w:r>
               <w:rPr>
@@ -202,7 +240,90 @@
                 <w:sz w:val="20"/>
                 <w:szCs w:val="20"/>
               </w:rPr>
-              <w:t>MBA graduate from UC Riverside (GPA 3.8) with 3+ years across strategy, analytics, and operations within Fortune 500 organizations and startup environments. Skilled at translating ambiguous business problems into fact-based analysis, reporting, and executive-ready recommendations while partnering across finance, operations, and marketing teams.</w:t>
+              <w:t>Strategy &amp; Operations</w:t>
+            </w:r>
+            <w:r>
+              <w:rPr>
+                <w:rFonts w:cstheme="minorHAnsi"/>
+                <w:sz w:val="20"/>
+                <w:szCs w:val="20"/>
+              </w:rPr>
+              <w:t xml:space="preserve"> </w:t>
+            </w:r>
+            <w:r>
+              <w:rPr>
+                <w:rFonts w:cstheme="minorHAnsi"/>
+                <w:sz w:val="20"/>
+                <w:szCs w:val="20"/>
+              </w:rPr>
+              <w:t xml:space="preserve">professional with an MBA and </w:t>
+            </w:r>
+            <w:r>
+              <w:rPr>
+                <w:rFonts w:cstheme="minorHAnsi"/>
+                <w:sz w:val="20"/>
+                <w:szCs w:val="20"/>
+              </w:rPr>
+              <w:t xml:space="preserve">3+ </w:t>
+            </w:r>
+            <w:r>
+              <w:rPr>
+                <w:rFonts w:cstheme="minorHAnsi"/>
+                <w:sz w:val="20"/>
+                <w:szCs w:val="20"/>
+              </w:rPr>
+              <w:t xml:space="preserve">of </w:t>
+            </w:r>
+            <w:r>
+              <w:rPr>
+                <w:rFonts w:cstheme="minorHAnsi"/>
+                <w:sz w:val="20"/>
+                <w:szCs w:val="20"/>
+              </w:rPr>
+              <w:t xml:space="preserve">experience solving complex business and operational problems across Hyundai Rotem, Thomson Reuters, Goldman Sachs, and startup environments </w:t>
+            </w:r>
+            <w:r>
+              <w:rPr>
+                <w:rFonts w:cstheme="minorHAnsi"/>
+                <w:sz w:val="20"/>
+                <w:szCs w:val="20"/>
+              </w:rPr>
+              <w:t>Combines process analysis, SQL and Excel reporting, cross-functional coordination, and AI-assisted problem-solving to improve workflows and translate data into practical business recommendations.</w:t>
+            </w:r>
+          </w:p>
+        </w:tc>
+      </w:tr>
+      <w:tr>
+        <w:tc>
+          <w:tcPr>
+            <w:tcW w:w="10466" w:type="dxa"/>
+            <w:gridSpan w:val="2"/>
+            <w:tcBorders>
+              <w:bottom w:val="single" w:sz="4" w:space="0" w:color="auto"/>
+            </w:tcBorders>
+          </w:tcPr>
+          <w:p>
+            <w:pPr>
+              <w:spacing w:before="120"/>
+              <w:jc w:val="both"/>
+              <w:rPr>
+                <w:b/>
+                <w:bCs/>
+                <w:i/>
+                <w:iCs/>
+                <w:sz w:val="20"/>
+                <w:szCs w:val="20"/>
+              </w:rPr>
+            </w:pPr>
+            <w:r>
+              <w:rPr>
+                <w:b/>
+                <w:bCs/>
+                <w:color w:val="2F5496" w:themeColor="accent1" w:themeShade="BF"/>
+                <w:sz w:val="20"/>
+                <w:szCs w:val="20"/>
+              </w:rPr>
+              <w:t xml:space="preserve">SKILLS </w:t>
             </w:r>
           </w:p>
         </w:tc>
@@ -213,125 +334,136 @@
             <w:tcW w:w="0" w:type="auto"/>
             <w:gridSpan w:val="2"/>
             <w:tcBorders>
-              <w:bottom w:val="single" w:sz="4" w:space="0" w:color="auto"/>
+              <w:top w:val="single" w:sz="4" w:space="0" w:color="auto"/>
             </w:tcBorders>
           </w:tcPr>
           <w:p>
             <w:pPr>
-              <w:spacing w:before="120"/>
-              <w:rPr>
-                <w:rFonts w:cstheme="minorHAnsi"/>
+              <w:jc w:val="both"/>
+              <w:rPr>
+                <w:sz w:val="20"/>
+                <w:szCs w:val="20"/>
+                <w:lang w:val="en-IN"/>
+              </w:rPr>
+            </w:pPr>
+            <w:r>
+              <w:rPr>
                 <w:b/>
                 <w:bCs/>
-                <w:color w:val="2F5496" w:themeColor="accent1" w:themeShade="BF"/>
-                <w:sz w:val="20"/>
-                <w:szCs w:val="20"/>
+                <w:sz w:val="20"/>
+                <w:szCs w:val="20"/>
+                <w:lang w:val="en-IN"/>
+              </w:rPr>
+              <w:t>Analytics &amp; Reporting:</w:t>
+            </w:r>
+            <w:r>
+              <w:rPr>
+                <w:sz w:val="20"/>
+                <w:szCs w:val="20"/>
+                <w:lang w:val="en-IN"/>
+              </w:rPr>
+              <w:t xml:space="preserve"> SQL, Advanced Excel, Power Query, Data Validation, Reconciliation, Variance Analysis, KPI Dashboards</w:t>
+            </w:r>
+          </w:p>
+          <w:p>
+            <w:pPr>
+              <w:jc w:val="both"/>
+              <w:rPr>
+                <w:sz w:val="20"/>
+                <w:szCs w:val="20"/>
+                <w:lang w:val="en-IN"/>
               </w:rPr>
             </w:pPr>
             <w:r>
               <w:rPr>
-                <w:rFonts w:cstheme="minorHAnsi"/>
                 <w:b/>
                 <w:bCs/>
-                <w:color w:val="2F5496" w:themeColor="accent1" w:themeShade="BF"/>
-                <w:sz w:val="20"/>
-                <w:szCs w:val="20"/>
-              </w:rPr>
-              <w:t>EDUCATION</w:t>
+                <w:sz w:val="20"/>
+                <w:szCs w:val="20"/>
+                <w:lang w:val="en-IN"/>
+              </w:rPr>
+              <w:t>Platforms:</w:t>
+            </w:r>
+            <w:r>
+              <w:rPr>
+                <w:sz w:val="20"/>
+                <w:szCs w:val="20"/>
+                <w:lang w:val="en-IN"/>
+              </w:rPr>
+              <w:t xml:space="preserve"> Tableau, Qlik Sense, Power BI, SharePoint, SAP Ariba, JIRA, Salesforce, PowerPoint</w:t>
+            </w:r>
+            <w:r>
+              <w:rPr>
+                <w:sz w:val="20"/>
+                <w:szCs w:val="20"/>
+                <w:lang w:val="en-IN"/>
+              </w:rPr>
+              <w:t xml:space="preserve">, Snowflake </w:t>
+            </w:r>
+          </w:p>
+          <w:p>
+            <w:pPr>
+              <w:jc w:val="both"/>
+              <w:rPr>
+                <w:sz w:val="20"/>
+                <w:szCs w:val="20"/>
+                <w:lang w:val="en-IN"/>
+              </w:rPr>
+            </w:pPr>
+            <w:r>
+              <w:rPr>
+                <w:b/>
+                <w:bCs/>
+                <w:sz w:val="20"/>
+                <w:szCs w:val="20"/>
+                <w:lang w:val="en-IN"/>
+              </w:rPr>
+              <w:t>AI &amp; Automation:</w:t>
+            </w:r>
+            <w:r>
+              <w:rPr>
+                <w:sz w:val="20"/>
+                <w:szCs w:val="20"/>
+                <w:lang w:val="en-IN"/>
+              </w:rPr>
+              <w:t xml:space="preserve"> Claude, ChatGPT, Excel Copilot, Gemini, n8n, AI-Assisted Research and Documentation</w:t>
+            </w:r>
+            <w:r>
+              <w:rPr>
+                <w:sz w:val="20"/>
+                <w:szCs w:val="20"/>
+                <w:lang w:val="en-IN"/>
+              </w:rPr>
+              <w:br/>
+            </w:r>
+            <w:r>
+              <w:rPr>
+                <w:b/>
+                <w:bCs/>
+                <w:sz w:val="20"/>
+                <w:szCs w:val="20"/>
+                <w:lang w:val="en-IN"/>
+              </w:rPr>
+              <w:t>Business Analysis:</w:t>
+            </w:r>
+            <w:r>
+              <w:rPr>
+                <w:sz w:val="20"/>
+                <w:szCs w:val="20"/>
+                <w:lang w:val="en-IN"/>
+              </w:rPr>
+              <w:t xml:space="preserve"> Requirements Gathering, Process Mapping, Root-Cause Analysis, Workflow Improvement, SOP Documentation, UAT Support</w:t>
             </w:r>
           </w:p>
         </w:tc>
       </w:tr>
       <w:tr>
+        <w:trPr>
+          <w:trHeight w:val="215"/>
+        </w:trPr>
         <w:tc>
           <w:tcPr>
-            <w:tcW w:w="8647" w:type="dxa"/>
-          </w:tcPr>
-          <w:p>
-            <w:r>
-              <w:rPr>
-                <w:rFonts w:cstheme="minorHAnsi"/>
-                <w:b/>
-                <w:bCs/>
-                <w:sz w:val="20"/>
-                <w:szCs w:val="20"/>
-              </w:rPr>
-              <w:t>Master of Business Administration (STEM MBA) - University of California, Riverside</w:t>
-            </w:r>
-            <w:r>
-              <w:rPr>
-                <w:rFonts w:cstheme="minorHAnsi"/>
-                <w:i/>
-                <w:iCs/>
-                <w:sz w:val="20"/>
-                <w:szCs w:val="20"/>
-              </w:rPr>
-              <w:t xml:space="preserve"> GPA: 3.8</w:t>
-            </w:r>
-          </w:p>
-          <w:p>
-            <w:r>
-              <w:rPr>
-                <w:rFonts w:cstheme="minorHAnsi"/>
-                <w:b/>
-                <w:bCs/>
-                <w:sz w:val="20"/>
-                <w:szCs w:val="20"/>
-              </w:rPr>
-              <w:t>Bachelor of Technology, Biotechnology - Vellore Institute of Technology, India</w:t>
-            </w:r>
-            <w:r>
-              <w:rPr>
-                <w:rFonts w:cstheme="minorHAnsi"/>
-                <w:i/>
-                <w:iCs/>
-                <w:sz w:val="20"/>
-                <w:szCs w:val="20"/>
-              </w:rPr>
-              <w:t xml:space="preserve"> GPA: 3.5</w:t>
-            </w:r>
-          </w:p>
-        </w:tc>
-        <w:tc>
-          <w:tcPr>
-            <w:tcW w:w="1819" w:type="dxa"/>
-          </w:tcPr>
-          <w:p>
-            <w:pPr>
-              <w:jc w:val="right"/>
-            </w:pPr>
-            <w:r>
-              <w:rPr>
-                <w:rFonts w:cstheme="minorHAnsi"/>
-                <w:b/>
-                <w:bCs/>
-                <w:sz w:val="20"/>
-                <w:szCs w:val="20"/>
-              </w:rPr>
-              <w:t>June 2026</w:t>
-            </w:r>
-          </w:p>
-          <w:p>
-            <w:pPr>
-              <w:jc w:val="right"/>
-            </w:pPr>
-            <w:r>
-              <w:rPr>
-                <w:rFonts w:cstheme="minorHAnsi"/>
-                <w:b/>
-                <w:bCs/>
-                <w:sz w:val="20"/>
-                <w:szCs w:val="20"/>
-              </w:rPr>
-              <w:t>Aug 2023</w:t>
-            </w:r>
-          </w:p>
-        </w:tc>
-      </w:tr>
-      <w:tr>
-        <w:tc>
-          <w:tcPr>
-            <w:tcW w:w="0" w:type="auto"/>
+            <w:tcW w:w="10466" w:type="dxa"/>
             <w:gridSpan w:val="2"/>
             <w:tcBorders>
               <w:bottom w:val="single" w:sz="4" w:space="0" w:color="auto"/>
@@ -340,8 +472,8 @@
           <w:p>
             <w:pPr>
               <w:spacing w:before="120"/>
-              <w:rPr>
-                <w:rFonts w:cstheme="minorHAnsi"/>
+              <w:jc w:val="both"/>
+              <w:rPr>
                 <w:b/>
                 <w:bCs/>
                 <w:color w:val="2F5496" w:themeColor="accent1" w:themeShade="BF"/>
@@ -351,186 +483,359 @@
             </w:pPr>
             <w:r>
               <w:rPr>
-                <w:rFonts w:cstheme="minorHAnsi"/>
                 <w:b/>
                 <w:bCs/>
                 <w:color w:val="2F5496" w:themeColor="accent1" w:themeShade="BF"/>
                 <w:sz w:val="20"/>
                 <w:szCs w:val="20"/>
               </w:rPr>
-              <w:t>SKILLS</w:t>
+              <w:t>EXPERIENCE</w:t>
+            </w:r>
+            <w:r>
+              <w:rPr>
+                <w:b/>
+                <w:bCs/>
+                <w:color w:val="2F5496" w:themeColor="accent1" w:themeShade="BF"/>
+                <w:sz w:val="20"/>
+                <w:szCs w:val="20"/>
+              </w:rPr>
+              <w:t xml:space="preserve"> </w:t>
             </w:r>
           </w:p>
         </w:tc>
       </w:tr>
       <w:tr>
+        <w:trPr>
+          <w:trHeight w:val="215"/>
+        </w:trPr>
         <w:tc>
           <w:tcPr>
-            <w:tcW w:w="0" w:type="auto"/>
+            <w:tcW w:w="8080" w:type="dxa"/>
+          </w:tcPr>
+          <w:p>
+            <w:pPr>
+              <w:jc w:val="both"/>
+              <w:rPr>
+                <w:b/>
+                <w:bCs/>
+                <w:sz w:val="20"/>
+                <w:szCs w:val="20"/>
+              </w:rPr>
+            </w:pPr>
+            <w:r>
+              <w:rPr>
+                <w:b/>
+                <w:bCs/>
+                <w:sz w:val="20"/>
+                <w:szCs w:val="20"/>
+              </w:rPr>
+              <w:t>Hyundai Rotem |</w:t>
+            </w:r>
+            <w:r>
+              <w:rPr>
+                <w:b/>
+                <w:bCs/>
+                <w:sz w:val="20"/>
+                <w:szCs w:val="20"/>
+              </w:rPr>
+              <w:t xml:space="preserve"> </w:t>
+            </w:r>
+            <w:r>
+              <w:rPr>
+                <w:b/>
+                <w:bCs/>
+                <w:sz w:val="20"/>
+                <w:szCs w:val="20"/>
+              </w:rPr>
+              <w:t>Strategy &amp; Operations</w:t>
+            </w:r>
+            <w:r>
+              <w:rPr>
+                <w:b/>
+                <w:bCs/>
+                <w:sz w:val="20"/>
+                <w:szCs w:val="20"/>
+              </w:rPr>
+              <w:t xml:space="preserve"> </w:t>
+            </w:r>
+            <w:r>
+              <w:rPr>
+                <w:b/>
+                <w:bCs/>
+                <w:sz w:val="20"/>
+                <w:szCs w:val="20"/>
+              </w:rPr>
+              <w:t xml:space="preserve">Consultant, </w:t>
+            </w:r>
+            <w:r>
+              <w:rPr>
+                <w:b/>
+                <w:bCs/>
+                <w:sz w:val="20"/>
+                <w:szCs w:val="20"/>
+              </w:rPr>
+              <w:t>MBA Client Engagement</w:t>
+            </w:r>
+          </w:p>
+        </w:tc>
+        <w:tc>
+          <w:tcPr>
+            <w:tcW w:w="2386" w:type="dxa"/>
+          </w:tcPr>
+          <w:p>
+            <w:pPr>
+              <w:jc w:val="right"/>
+              <w:rPr>
+                <w:b/>
+                <w:bCs/>
+                <w:sz w:val="20"/>
+                <w:szCs w:val="20"/>
+              </w:rPr>
+            </w:pPr>
+            <w:r>
+              <w:rPr>
+                <w:b/>
+                <w:bCs/>
+                <w:sz w:val="20"/>
+                <w:szCs w:val="20"/>
+              </w:rPr>
+              <w:t>Mar 2026 – Jul 2026</w:t>
+            </w:r>
+          </w:p>
+        </w:tc>
+      </w:tr>
+      <w:tr>
+        <w:trPr>
+          <w:trHeight w:val="215"/>
+        </w:trPr>
+        <w:tc>
+          <w:tcPr>
+            <w:tcW w:w="10466" w:type="dxa"/>
             <w:gridSpan w:val="2"/>
           </w:tcPr>
           <w:p>
             <w:pPr>
+              <w:pStyle w:val="ListParagraph"/>
+              <w:numPr>
+                <w:ilvl w:val="0"/>
+                <w:numId w:val="27"/>
+              </w:numPr>
               <w:jc w:val="both"/>
+              <w:rPr>
+                <w:sz w:val="20"/>
+                <w:szCs w:val="20"/>
+              </w:rPr>
             </w:pPr>
             <w:r>
               <w:rPr>
-                <w:rFonts w:cstheme="minorHAnsi"/>
-                <w:b/>
-                <w:bCs/>
-                <w:sz w:val="20"/>
-                <w:szCs w:val="20"/>
-              </w:rPr>
-              <w:t>Business Strategy:</w:t>
-            </w:r>
-            <w:r>
-              <w:rPr>
-                <w:rFonts w:cstheme="minorHAnsi"/>
-                <w:sz w:val="20"/>
-                <w:szCs w:val="20"/>
-              </w:rPr>
-              <w:t xml:space="preserve"> Business Strategy, Strategic Planning, Annual Business Planning, Business Case Development, Market Research, Stakeholder Management</w:t>
+                <w:sz w:val="20"/>
+                <w:szCs w:val="20"/>
+              </w:rPr>
+              <w:t>Mapped manufacturing, inventory, testing, and material-flow processes through facility assessments, stakeholder interviews, and workflow analysis to identify operational bottlenecks.</w:t>
             </w:r>
           </w:p>
           <w:p>
             <w:pPr>
+              <w:pStyle w:val="ListParagraph"/>
+              <w:numPr>
+                <w:ilvl w:val="0"/>
+                <w:numId w:val="27"/>
+              </w:numPr>
               <w:jc w:val="both"/>
+              <w:rPr>
+                <w:sz w:val="20"/>
+                <w:szCs w:val="20"/>
+              </w:rPr>
             </w:pPr>
             <w:r>
               <w:rPr>
-                <w:rFonts w:cstheme="minorHAnsi"/>
-                <w:b/>
-                <w:bCs/>
-                <w:sz w:val="20"/>
-                <w:szCs w:val="20"/>
-              </w:rPr>
-              <w:t>Analytics &amp; Reporting:</w:t>
-            </w:r>
-            <w:r>
-              <w:rPr>
-                <w:rFonts w:cstheme="minorHAnsi"/>
-                <w:sz w:val="20"/>
-                <w:szCs w:val="20"/>
-              </w:rPr>
-              <w:t xml:space="preserve"> SQL, Python, Advanced Excel (Pivot Tables, XLOOKUP, Power Query), Tableau, Qlik Sense, KPI Reporting, Data Visualization</w:t>
+                <w:sz w:val="20"/>
+                <w:szCs w:val="20"/>
+              </w:rPr>
+              <w:t>Quantified constraints including 145 meters of material travel, 24–32 hours of weekly idle test capacity, and space limitations affecting technician expansion from 12 to 35.</w:t>
             </w:r>
           </w:p>
           <w:p>
             <w:pPr>
+              <w:pStyle w:val="ListParagraph"/>
+              <w:numPr>
+                <w:ilvl w:val="0"/>
+                <w:numId w:val="27"/>
+              </w:numPr>
               <w:jc w:val="both"/>
+              <w:rPr>
+                <w:sz w:val="20"/>
+                <w:szCs w:val="20"/>
+              </w:rPr>
             </w:pPr>
             <w:r>
               <w:rPr>
-                <w:rFonts w:cstheme="minorHAnsi"/>
-                <w:b/>
-                <w:bCs/>
-                <w:sz w:val="20"/>
-                <w:szCs w:val="20"/>
-              </w:rPr>
-              <w:t>Operations &amp; Execution:</w:t>
-            </w:r>
-            <w:r>
-              <w:rPr>
-                <w:rFonts w:cstheme="minorHAnsi"/>
-                <w:sz w:val="20"/>
-                <w:szCs w:val="20"/>
-              </w:rPr>
-              <w:t xml:space="preserve"> Cross-Functional Leadership, Program Management, Process Improvement, Operational Excellence, OKR Design &amp; Tracking, Change Management</w:t>
+                <w:sz w:val="20"/>
+                <w:szCs w:val="20"/>
+              </w:rPr>
+              <w:t>Deployed</w:t>
+            </w:r>
+            <w:r>
+              <w:rPr>
+                <w:sz w:val="20"/>
+                <w:szCs w:val="20"/>
+              </w:rPr>
+              <w:t xml:space="preserve"> Claude to synthesize stakeholder inputs, structure root-cause analysis, and evaluate four future-state operating scenarios involving FIFO workflows, dedicated testing zones, and improved shipping layouts.</w:t>
             </w:r>
           </w:p>
           <w:p>
             <w:pPr>
+              <w:pStyle w:val="ListParagraph"/>
+              <w:numPr>
+                <w:ilvl w:val="0"/>
+                <w:numId w:val="27"/>
+              </w:numPr>
               <w:jc w:val="both"/>
-            </w:pPr>
-            <w:r>
-              <w:rPr>
-                <w:rFonts w:cstheme="minorHAnsi"/>
+              <w:rPr>
                 <w:b/>
                 <w:bCs/>
-                <w:sz w:val="20"/>
-                <w:szCs w:val="20"/>
-              </w:rPr>
-              <w:t>Tools &amp; AI:</w:t>
-            </w:r>
-            <w:r>
-              <w:rPr>
-                <w:rFonts w:cstheme="minorHAnsi"/>
-                <w:sz w:val="20"/>
-                <w:szCs w:val="20"/>
-              </w:rPr>
-              <w:t xml:space="preserve"> ChatGPT, Claude, Gemini, Excel Copilot, n8n, Salesforce, SAP Ariba, JIRA, HubSpot, PowerPoint</w:t>
+                <w:color w:val="2F5496" w:themeColor="accent1" w:themeShade="BF"/>
+                <w:sz w:val="20"/>
+                <w:szCs w:val="20"/>
+              </w:rPr>
+            </w:pPr>
+            <w:r>
+              <w:rPr>
+                <w:sz w:val="20"/>
+                <w:szCs w:val="20"/>
+              </w:rPr>
+              <w:t>Built a KPI framework and six-month implementation roadmap under $260K, projected to support 2x throughput, 2–3 weekly shipments, and payback within 18 months.</w:t>
             </w:r>
           </w:p>
         </w:tc>
       </w:tr>
       <w:tr>
+        <w:trPr>
+          <w:trHeight w:val="215"/>
+        </w:trPr>
         <w:tc>
           <w:tcPr>
-            <w:tcW w:w="0" w:type="auto"/>
-            <w:gridSpan w:val="2"/>
-            <w:tcBorders>
-              <w:bottom w:val="single" w:sz="4" w:space="0" w:color="auto"/>
-            </w:tcBorders>
+            <w:tcW w:w="8080" w:type="dxa"/>
           </w:tcPr>
           <w:p>
             <w:pPr>
-              <w:spacing w:before="120"/>
-              <w:rPr>
-                <w:rFonts w:cstheme="minorHAnsi"/>
+              <w:jc w:val="both"/>
+              <w:rPr>
                 <w:b/>
                 <w:bCs/>
-                <w:color w:val="2F5496" w:themeColor="accent1" w:themeShade="BF"/>
                 <w:sz w:val="20"/>
                 <w:szCs w:val="20"/>
               </w:rPr>
             </w:pPr>
             <w:r>
               <w:rPr>
-                <w:rFonts w:cstheme="minorHAnsi"/>
                 <w:b/>
                 <w:bCs/>
-                <w:color w:val="2F5496" w:themeColor="accent1" w:themeShade="BF"/>
-                <w:sz w:val="20"/>
-                <w:szCs w:val="20"/>
-              </w:rPr>
-              <w:t>EXPERIENCE</w:t>
-            </w:r>
-          </w:p>
-        </w:tc>
-      </w:tr>
-      <w:tr>
-        <w:tc>
-          <w:tcPr>
-            <w:tcW w:w="8647" w:type="dxa"/>
-          </w:tcPr>
-          <w:p>
-            <w:pPr>
-              <w:spacing w:before="120"/>
-            </w:pPr>
-            <w:r>
-              <w:rPr>
-                <w:rFonts w:cstheme="minorHAnsi"/>
+                <w:sz w:val="20"/>
+                <w:szCs w:val="20"/>
+              </w:rPr>
+              <w:t>BB Wellness</w:t>
+            </w:r>
+            <w:r>
+              <w:rPr>
                 <w:b/>
                 <w:bCs/>
                 <w:sz w:val="20"/>
                 <w:szCs w:val="20"/>
               </w:rPr>
-              <w:t xml:space="preserve">BB Wellness | Analyst </w:t>
+              <w:t xml:space="preserve"> </w:t>
+            </w:r>
+            <w:r>
+              <w:rPr>
+                <w:b/>
+                <w:bCs/>
+                <w:sz w:val="20"/>
+                <w:szCs w:val="20"/>
+              </w:rPr>
+              <w:t>|</w:t>
+            </w:r>
+            <w:r>
+              <w:rPr>
+                <w:b/>
+                <w:bCs/>
+                <w:sz w:val="20"/>
+                <w:szCs w:val="20"/>
+              </w:rPr>
+              <w:t xml:space="preserve"> </w:t>
+            </w:r>
+            <w:r>
+              <w:rPr>
+                <w:b/>
+                <w:bCs/>
+                <w:sz w:val="20"/>
+                <w:szCs w:val="20"/>
+              </w:rPr>
+              <w:t>Analyst</w:t>
+            </w:r>
+            <w:r>
+              <w:rPr>
+                <w:b/>
+                <w:bCs/>
+                <w:sz w:val="20"/>
+                <w:szCs w:val="20"/>
+              </w:rPr>
+              <w:t xml:space="preserve"> </w:t>
+            </w:r>
+            <w:r>
+              <w:rPr>
+                <w:b/>
+                <w:bCs/>
+                <w:sz w:val="20"/>
+                <w:szCs w:val="20"/>
+              </w:rPr>
+              <w:t>–</w:t>
+            </w:r>
+            <w:r>
+              <w:rPr>
+                <w:b/>
+                <w:bCs/>
+                <w:sz w:val="20"/>
+                <w:szCs w:val="20"/>
+              </w:rPr>
+              <w:t xml:space="preserve"> </w:t>
+            </w:r>
+            <w:r>
+              <w:rPr>
+                <w:b/>
+                <w:bCs/>
+                <w:sz w:val="20"/>
+                <w:szCs w:val="20"/>
+              </w:rPr>
+              <w:t>Strategy &amp; Operations</w:t>
+            </w:r>
+            <w:r>
+              <w:rPr>
+                <w:b/>
+                <w:bCs/>
+                <w:sz w:val="20"/>
+                <w:szCs w:val="20"/>
+              </w:rPr>
+              <w:t xml:space="preserve">                           </w:t>
             </w:r>
           </w:p>
         </w:tc>
         <w:tc>
           <w:tcPr>
-            <w:tcW w:w="1819" w:type="dxa"/>
+            <w:tcW w:w="2386" w:type="dxa"/>
           </w:tcPr>
           <w:p>
             <w:pPr>
-              <w:spacing w:before="120"/>
               <w:jc w:val="right"/>
+              <w:rPr>
+                <w:b/>
+                <w:bCs/>
+                <w:color w:val="2F5496" w:themeColor="accent1" w:themeShade="BF"/>
+                <w:sz w:val="20"/>
+                <w:szCs w:val="20"/>
+              </w:rPr>
             </w:pPr>
             <w:r>
               <w:rPr>
-                <w:rFonts w:cstheme="minorHAnsi"/>
                 <w:b/>
                 <w:bCs/>
                 <w:sz w:val="20"/>
@@ -556,18 +861,18 @@
               </w:numPr>
               <w:jc w:val="both"/>
               <w:rPr>
-                <w:rFonts w:cstheme="minorHAnsi"/>
-                <w:sz w:val="20"/>
-                <w:szCs w:val="20"/>
+                <w:sz w:val="20"/>
+                <w:szCs w:val="20"/>
+                <w:lang w:val="en-IN"/>
               </w:rPr>
             </w:pPr>
             <w:r>
               <w:rPr>
-                <w:rFonts w:cstheme="minorHAnsi"/>
-                <w:sz w:val="20"/>
-                <w:szCs w:val="20"/>
-              </w:rPr>
-              <w:t>Defined go-to-market problem scope through market segmentation and competitive benchmarking across 6 competitors, translating research into fact-based product positioning recommendations for leadership.</w:t>
+                <w:sz w:val="20"/>
+                <w:szCs w:val="20"/>
+                <w:lang w:val="en-IN"/>
+              </w:rPr>
+              <w:t>Analyzed campaign performance and competitive activity across 20+ companies, delivering positioning and growth recommendations to leadership.</w:t>
             </w:r>
           </w:p>
           <w:p>
@@ -579,18 +884,18 @@
               </w:numPr>
               <w:jc w:val="both"/>
               <w:rPr>
-                <w:rFonts w:cstheme="minorHAnsi"/>
-                <w:sz w:val="20"/>
-                <w:szCs w:val="20"/>
+                <w:sz w:val="20"/>
+                <w:szCs w:val="20"/>
+                <w:lang w:val="en-IN"/>
               </w:rPr>
             </w:pPr>
             <w:r>
               <w:rPr>
-                <w:rFonts w:cstheme="minorHAnsi"/>
-                <w:sz w:val="20"/>
-                <w:szCs w:val="20"/>
-              </w:rPr>
-              <w:t>Built SQL-driven KPI dashboards spanning 4 channels, establishing a centralized reporting framework that surfaced performance gaps and enabled leadership to prioritize strategic initiatives.</w:t>
+                <w:sz w:val="20"/>
+                <w:szCs w:val="20"/>
+                <w:lang w:val="en-IN"/>
+              </w:rPr>
+              <w:t>Built Excel-based KPI trackers across four marketing channels and managed social scheduling via Buffer, improving on-time posting consistency by roughly 35% and giving leadership clearer visibility into channel performance.</w:t>
             </w:r>
           </w:p>
           <w:p>
@@ -602,18 +907,17 @@
               </w:numPr>
               <w:jc w:val="both"/>
               <w:rPr>
-                <w:rFonts w:cstheme="minorHAnsi"/>
                 <w:sz w:val="20"/>
                 <w:szCs w:val="20"/>
               </w:rPr>
             </w:pPr>
             <w:r>
               <w:rPr>
-                <w:rFonts w:cstheme="minorHAnsi"/>
-                <w:sz w:val="20"/>
-                <w:szCs w:val="20"/>
-              </w:rPr>
-              <w:t>Developed hypothesis-driven business cases and strategic roadmaps, partnering with marketing, content, and operations stakeholders to align 10+ cross-functional initiatives against weekly OKRs.</w:t>
+                <w:sz w:val="20"/>
+                <w:szCs w:val="20"/>
+                <w:lang w:val="en-IN"/>
+              </w:rPr>
+              <w:t>Coordinated 10+ cross-functional initiatives and supported outreach to 15+ prospective angel investors, using Claude and ChatGPT to speed up research and reporting along the way.</w:t>
             </w:r>
           </w:p>
         </w:tc>
@@ -621,36 +925,54 @@
       <w:tr>
         <w:tc>
           <w:tcPr>
-            <w:tcW w:w="8647" w:type="dxa"/>
+            <w:tcW w:w="8080" w:type="dxa"/>
           </w:tcPr>
           <w:p>
             <w:pPr>
-              <w:spacing w:before="120"/>
-            </w:pPr>
-            <w:r>
-              <w:rPr>
-                <w:rFonts w:cstheme="minorHAnsi"/>
+              <w:jc w:val="both"/>
+              <w:rPr>
                 <w:b/>
                 <w:bCs/>
                 <w:sz w:val="20"/>
                 <w:szCs w:val="20"/>
               </w:rPr>
-              <w:t>Thomson Reuters | Analyst – Global Operations</w:t>
+            </w:pPr>
+            <w:r>
+              <w:rPr>
+                <w:b/>
+                <w:bCs/>
+                <w:sz w:val="20"/>
+                <w:szCs w:val="20"/>
+              </w:rPr>
+              <w:t xml:space="preserve">Thomson Reuters | Analyst – Global </w:t>
+            </w:r>
+            <w:r>
+              <w:rPr>
+                <w:b/>
+                <w:bCs/>
+                <w:sz w:val="20"/>
+                <w:szCs w:val="20"/>
+              </w:rPr>
+              <w:t>Strategy &amp; Operations</w:t>
             </w:r>
           </w:p>
         </w:tc>
         <w:tc>
           <w:tcPr>
-            <w:tcW w:w="1819" w:type="dxa"/>
+            <w:tcW w:w="2386" w:type="dxa"/>
           </w:tcPr>
           <w:p>
             <w:pPr>
-              <w:spacing w:before="120"/>
               <w:jc w:val="right"/>
+              <w:rPr>
+                <w:b/>
+                <w:bCs/>
+                <w:sz w:val="20"/>
+                <w:szCs w:val="20"/>
+              </w:rPr>
             </w:pPr>
             <w:r>
               <w:rPr>
-                <w:rFonts w:cstheme="minorHAnsi"/>
                 <w:b/>
                 <w:bCs/>
                 <w:sz w:val="20"/>
@@ -676,18 +998,16 @@
               </w:numPr>
               <w:jc w:val="both"/>
               <w:rPr>
-                <w:rFonts w:cstheme="minorHAnsi"/>
                 <w:sz w:val="20"/>
                 <w:szCs w:val="20"/>
               </w:rPr>
             </w:pPr>
             <w:r>
               <w:rPr>
-                <w:rFonts w:cstheme="minorHAnsi"/>
-                <w:sz w:val="20"/>
-                <w:szCs w:val="20"/>
-              </w:rPr>
-              <w:t>Built 15+ SQL and Excel reporting frameworks adopted across 3 global business units, reducing manual reporting effort ~30% and improving executive visibility into business performance.</w:t>
+                <w:sz w:val="20"/>
+                <w:szCs w:val="20"/>
+              </w:rPr>
+              <w:t>Analyzed Paris Olympics budget versus actuals using SQL joins and Excel across vendor, purchase-order, and expense data, identifying overspend and underspend for stakeholder action.</w:t>
             </w:r>
           </w:p>
           <w:p>
@@ -699,18 +1019,16 @@
               </w:numPr>
               <w:jc w:val="both"/>
               <w:rPr>
-                <w:rFonts w:cstheme="minorHAnsi"/>
                 <w:sz w:val="20"/>
                 <w:szCs w:val="20"/>
               </w:rPr>
             </w:pPr>
             <w:r>
               <w:rPr>
-                <w:rFonts w:cstheme="minorHAnsi"/>
-                <w:sz w:val="20"/>
-                <w:szCs w:val="20"/>
-              </w:rPr>
-              <w:t>Partnered with finance, procurement, and operations stakeholders across 4 regions to standardize KPIs and support Quarterly Business Reviews, budgeting, and annual business planning.</w:t>
+                <w:sz w:val="20"/>
+                <w:szCs w:val="20"/>
+              </w:rPr>
+              <w:t>Migrated a manual, error-prone Excel case tracker to a centralized SharePoint dashboard across three global business units, cutting version-control errors by roughly 30% and giving managers real-time visibility into case ownership and status.</w:t>
             </w:r>
           </w:p>
           <w:p>
@@ -722,18 +1040,37 @@
               </w:numPr>
               <w:jc w:val="both"/>
               <w:rPr>
-                <w:rFonts w:cstheme="minorHAnsi"/>
                 <w:sz w:val="20"/>
                 <w:szCs w:val="20"/>
               </w:rPr>
             </w:pPr>
             <w:r>
               <w:rPr>
-                <w:rFonts w:cstheme="minorHAnsi"/>
-                <w:sz w:val="20"/>
-                <w:szCs w:val="20"/>
-              </w:rPr>
-              <w:t>Prepared executive summaries translating complex, multi-source analyses into structured business recommendations for senior leadership.</w:t>
+                <w:sz w:val="20"/>
+                <w:szCs w:val="20"/>
+              </w:rPr>
+              <w:t>Validated SAP Ariba transactions, reconciled financial and operational records, and partnered with finance, procurement, and operations teams to resolve workflow discrepancies.</w:t>
+            </w:r>
+          </w:p>
+          <w:p>
+            <w:pPr>
+              <w:pStyle w:val="ListParagraph"/>
+              <w:numPr>
+                <w:ilvl w:val="0"/>
+                <w:numId w:val="27"/>
+              </w:numPr>
+              <w:jc w:val="both"/>
+              <w:rPr>
+                <w:sz w:val="20"/>
+                <w:szCs w:val="20"/>
+              </w:rPr>
+            </w:pPr>
+            <w:r>
+              <w:rPr>
+                <w:sz w:val="20"/>
+                <w:szCs w:val="20"/>
+              </w:rPr>
+              <w:t>Mapped current-state processes, developed SOPs, and translated root-cause findings into executive reports supporting process standardization, governance, and automation initiatives.</w:t>
             </w:r>
           </w:p>
         </w:tc>
@@ -741,36 +1078,108 @@
       <w:tr>
         <w:tc>
           <w:tcPr>
-            <w:tcW w:w="8647" w:type="dxa"/>
+            <w:tcW w:w="8080" w:type="dxa"/>
           </w:tcPr>
           <w:p>
             <w:pPr>
-              <w:spacing w:before="120"/>
-            </w:pPr>
-            <w:r>
-              <w:rPr>
-                <w:rFonts w:cstheme="minorHAnsi"/>
+              <w:jc w:val="both"/>
+              <w:rPr>
                 <w:b/>
                 <w:bCs/>
                 <w:sz w:val="20"/>
                 <w:szCs w:val="20"/>
               </w:rPr>
-              <w:t>Goldman Sachs | STEM Intern – Asset &amp; Wealth Management</w:t>
+            </w:pPr>
+            <w:r>
+              <w:rPr>
+                <w:b/>
+                <w:bCs/>
+                <w:sz w:val="20"/>
+                <w:szCs w:val="20"/>
+              </w:rPr>
+              <w:t>Goldm</w:t>
+            </w:r>
+            <w:r>
+              <w:rPr>
+                <w:b/>
+                <w:bCs/>
+                <w:sz w:val="20"/>
+                <w:szCs w:val="20"/>
+              </w:rPr>
+              <w:t>a</w:t>
+            </w:r>
+            <w:r>
+              <w:rPr>
+                <w:b/>
+                <w:bCs/>
+                <w:sz w:val="20"/>
+                <w:szCs w:val="20"/>
+              </w:rPr>
+              <w:t xml:space="preserve">n Sachs | STEM </w:t>
+            </w:r>
+            <w:r>
+              <w:rPr>
+                <w:b/>
+                <w:bCs/>
+                <w:sz w:val="20"/>
+                <w:szCs w:val="20"/>
+              </w:rPr>
+              <w:t>Analyst</w:t>
+            </w:r>
+            <w:r>
+              <w:rPr>
+                <w:b/>
+                <w:bCs/>
+                <w:sz w:val="20"/>
+                <w:szCs w:val="20"/>
+              </w:rPr>
+              <w:t xml:space="preserve"> – Asset &amp; Wealth Management</w:t>
+            </w:r>
+            <w:r>
+              <w:rPr>
+                <w:b/>
+                <w:bCs/>
+                <w:sz w:val="20"/>
+                <w:szCs w:val="20"/>
+              </w:rPr>
+              <w:tab/>
             </w:r>
           </w:p>
         </w:tc>
         <w:tc>
           <w:tcPr>
-            <w:tcW w:w="1819" w:type="dxa"/>
+            <w:tcW w:w="2386" w:type="dxa"/>
           </w:tcPr>
           <w:p>
             <w:pPr>
-              <w:spacing w:before="120"/>
-              <w:jc w:val="right"/>
+              <w:jc w:val="both"/>
+              <w:rPr>
+                <w:b/>
+                <w:bCs/>
+                <w:sz w:val="20"/>
+                <w:szCs w:val="20"/>
+              </w:rPr>
             </w:pPr>
             <w:r>
               <w:rPr>
-                <w:rFonts w:cstheme="minorHAnsi"/>
+                <w:b/>
+                <w:bCs/>
+                <w:sz w:val="20"/>
+                <w:szCs w:val="20"/>
+              </w:rPr>
+              <w:t xml:space="preserve">   </w:t>
+            </w:r>
+            <w:r>
+              <w:rPr>
+                <w:b/>
+                <w:bCs/>
+                <w:sz w:val="20"/>
+                <w:szCs w:val="20"/>
+              </w:rPr>
+              <w:t xml:space="preserve">          </w:t>
+            </w:r>
+            <w:r>
+              <w:rPr>
                 <w:b/>
                 <w:bCs/>
                 <w:sz w:val="20"/>
@@ -796,18 +1205,16 @@
               </w:numPr>
               <w:jc w:val="both"/>
               <w:rPr>
-                <w:rFonts w:cstheme="minorHAnsi"/>
                 <w:sz w:val="20"/>
                 <w:szCs w:val="20"/>
               </w:rPr>
             </w:pPr>
             <w:r>
               <w:rPr>
-                <w:rFonts w:cstheme="minorHAnsi"/>
-                <w:sz w:val="20"/>
-                <w:szCs w:val="20"/>
-              </w:rPr>
-              <w:t>Built Qlik Sense dashboards consolidating 5+ operational data sources, improving executive visibility into business performance across AWM.</w:t>
+                <w:sz w:val="20"/>
+                <w:szCs w:val="20"/>
+              </w:rPr>
+              <w:t>Mapped Client Revenue Operations and Institutional Reporting workflows using Excel, Qlik Sense, and JIRA, identifying manual dependencies and automation opportunities.</w:t>
             </w:r>
           </w:p>
           <w:p>
@@ -819,18 +1226,16 @@
               </w:numPr>
               <w:jc w:val="both"/>
               <w:rPr>
-                <w:rFonts w:cstheme="minorHAnsi"/>
                 <w:sz w:val="20"/>
                 <w:szCs w:val="20"/>
               </w:rPr>
             </w:pPr>
             <w:r>
               <w:rPr>
-                <w:rFonts w:cstheme="minorHAnsi"/>
-                <w:sz w:val="20"/>
-                <w:szCs w:val="20"/>
-              </w:rPr>
-              <w:t>Identified process gaps through workflow analysis using Excel, JIRA, and Qlik Sense, strengthening compliance reporting and operational controls.</w:t>
+                <w:sz w:val="20"/>
+                <w:szCs w:val="20"/>
+              </w:rPr>
+              <w:t>Built a refreshable Power Query workflow to clean, standardize, and merge monthly billing files with master data, cutting manual prep time by roughly 50% and improving consistency of the monthly revenue dashboard.</w:t>
             </w:r>
           </w:p>
           <w:p>
@@ -842,18 +1247,37 @@
               </w:numPr>
               <w:jc w:val="both"/>
               <w:rPr>
-                <w:rFonts w:cstheme="minorHAnsi"/>
                 <w:sz w:val="20"/>
                 <w:szCs w:val="20"/>
               </w:rPr>
             </w:pPr>
             <w:r>
               <w:rPr>
-                <w:rFonts w:cstheme="minorHAnsi"/>
-                <w:sz w:val="20"/>
-                <w:szCs w:val="20"/>
-              </w:rPr>
-              <w:t>Developed operational trackers monitoring hundreds of client commitments, improving workflow transparency and cross-team reporting consistency.</w:t>
+                <w:sz w:val="20"/>
+                <w:szCs w:val="20"/>
+              </w:rPr>
+              <w:t>Standardized commitment names using client, portfolio, and reporting frequency, improving cross-team mapping and reducing ambiguity across recurring reports.</w:t>
+            </w:r>
+          </w:p>
+          <w:p>
+            <w:pPr>
+              <w:pStyle w:val="ListParagraph"/>
+              <w:numPr>
+                <w:ilvl w:val="0"/>
+                <w:numId w:val="27"/>
+              </w:numPr>
+              <w:jc w:val="both"/>
+              <w:rPr>
+                <w:sz w:val="20"/>
+                <w:szCs w:val="20"/>
+              </w:rPr>
+            </w:pPr>
+            <w:r>
+              <w:rPr>
+                <w:sz w:val="20"/>
+                <w:szCs w:val="20"/>
+              </w:rPr>
+              <w:t>Developed trackers for hundreds of client commitments, reporting exceptions, and follow-up actions, strengthening workflow visibility, governance, and timely execution.</w:t>
             </w:r>
           </w:p>
         </w:tc>
@@ -861,15 +1285,20 @@
       <w:tr>
         <w:tc>
           <w:tcPr>
-            <w:tcW w:w="8647" w:type="dxa"/>
+            <w:tcW w:w="8080" w:type="dxa"/>
           </w:tcPr>
           <w:p>
             <w:pPr>
-              <w:spacing w:before="120"/>
+              <w:jc w:val="both"/>
+              <w:rPr>
+                <w:b/>
+                <w:bCs/>
+                <w:sz w:val="20"/>
+                <w:szCs w:val="20"/>
+              </w:rPr>
             </w:pPr>
             <w:r>
               <w:rPr>
-                <w:rFonts w:cstheme="minorHAnsi"/>
                 <w:b/>
                 <w:bCs/>
                 <w:sz w:val="20"/>
@@ -881,22 +1310,53 @@
         </w:tc>
         <w:tc>
           <w:tcPr>
-            <w:tcW w:w="1819" w:type="dxa"/>
+            <w:tcW w:w="2386" w:type="dxa"/>
           </w:tcPr>
           <w:p>
             <w:pPr>
-              <w:spacing w:before="120"/>
               <w:jc w:val="right"/>
-            </w:pPr>
-            <w:r>
-              <w:rPr>
-                <w:rFonts w:cstheme="minorHAnsi"/>
+              <w:rPr>
                 <w:b/>
                 <w:bCs/>
                 <w:sz w:val="20"/>
                 <w:szCs w:val="20"/>
               </w:rPr>
-              <w:t>Jun 2022 – Aug 2022</w:t>
+            </w:pPr>
+            <w:r>
+              <w:rPr>
+                <w:b/>
+                <w:bCs/>
+                <w:sz w:val="20"/>
+                <w:szCs w:val="20"/>
+              </w:rPr>
+              <w:t xml:space="preserve">  </w:t>
+            </w:r>
+            <w:r>
+              <w:rPr>
+                <w:b/>
+                <w:bCs/>
+                <w:sz w:val="20"/>
+                <w:szCs w:val="20"/>
+              </w:rPr>
+              <w:t>Jun 202</w:t>
+            </w:r>
+            <w:r>
+              <w:rPr>
+                <w:b/>
+                <w:bCs/>
+                <w:sz w:val="20"/>
+                <w:szCs w:val="20"/>
+              </w:rPr>
+              <w:t>2</w:t>
+            </w:r>
+            <w:r>
+              <w:rPr>
+                <w:b/>
+                <w:bCs/>
+                <w:sz w:val="20"/>
+                <w:szCs w:val="20"/>
+              </w:rPr>
+              <w:t xml:space="preserve"> – Aug 2022</w:t>
             </w:r>
           </w:p>
         </w:tc>
@@ -914,20 +1374,17 @@
                 <w:ilvl w:val="0"/>
                 <w:numId w:val="27"/>
               </w:numPr>
-              <w:jc w:val="both"/>
-              <w:rPr>
-                <w:rFonts w:cstheme="minorHAnsi"/>
+              <w:rPr>
                 <w:sz w:val="20"/>
                 <w:szCs w:val="20"/>
               </w:rPr>
             </w:pPr>
             <w:r>
               <w:rPr>
-                <w:rFonts w:cstheme="minorHAnsi"/>
-                <w:sz w:val="20"/>
-                <w:szCs w:val="20"/>
-              </w:rPr>
-              <w:t>Analyzed business datasets using SQL, Python, and Excel; built Tableau dashboards enabling real-time performance monitoring for healthcare clients.</w:t>
+                <w:sz w:val="20"/>
+                <w:szCs w:val="20"/>
+              </w:rPr>
+              <w:t>Analyzed regional medical-device sales data using SQL, Python, and Excel, and built Tableau and Power BI dashboards to track units sold and regional performance, helping teams identify underperforming markets.</w:t>
             </w:r>
           </w:p>
         </w:tc>
@@ -944,25 +1401,21 @@
           <w:p>
             <w:pPr>
               <w:spacing w:before="120"/>
-              <w:rPr>
-                <w:rFonts w:cstheme="minorHAnsi"/>
+              <w:jc w:val="both"/>
+              <w:rPr>
+                <w:sz w:val="20"/>
+                <w:szCs w:val="20"/>
+              </w:rPr>
+            </w:pPr>
+            <w:r>
+              <w:rPr>
                 <w:b/>
                 <w:bCs/>
                 <w:color w:val="2F5496" w:themeColor="accent1" w:themeShade="BF"/>
                 <w:sz w:val="20"/>
                 <w:szCs w:val="20"/>
               </w:rPr>
-            </w:pPr>
-            <w:r>
-              <w:rPr>
-                <w:rFonts w:cstheme="minorHAnsi"/>
-                <w:b/>
-                <w:bCs/>
-                <w:color w:val="2F5496" w:themeColor="accent1" w:themeShade="BF"/>
-                <w:sz w:val="20"/>
-                <w:szCs w:val="20"/>
-              </w:rPr>
-              <w:t>PROJECTS &amp; LEADERSHIP</w:t>
+              <w:t>EDUCATION</w:t>
             </w:r>
           </w:p>
         </w:tc>
@@ -972,103 +1425,165 @@
           <w:tcPr>
             <w:tcW w:w="0" w:type="auto"/>
             <w:gridSpan w:val="2"/>
+            <w:tcBorders>
+              <w:top w:val="single" w:sz="4" w:space="0" w:color="auto"/>
+            </w:tcBorders>
           </w:tcPr>
           <w:p>
-            <w:r>
-              <w:rPr>
-                <w:rFonts w:cstheme="minorHAnsi"/>
+            <w:pPr>
+              <w:jc w:val="both"/>
+              <w:rPr>
+                <w:sz w:val="20"/>
+                <w:szCs w:val="20"/>
+                <w:lang w:val="en-IN"/>
+              </w:rPr>
+            </w:pPr>
+            <w:r>
+              <w:rPr>
                 <w:b/>
                 <w:bCs/>
                 <w:sz w:val="20"/>
                 <w:szCs w:val="20"/>
-              </w:rPr>
-              <w:t>Hyundai Rotem Operations Consulting Project</w:t>
+                <w:lang w:val="en-IN"/>
+              </w:rPr>
+              <w:t>Master of Business Administration (</w:t>
+            </w:r>
+            <w:r>
+              <w:rPr>
+                <w:b/>
+                <w:bCs/>
+                <w:sz w:val="20"/>
+                <w:szCs w:val="20"/>
+                <w:lang w:val="en-IN"/>
+              </w:rPr>
+              <w:t xml:space="preserve">STEM </w:t>
+            </w:r>
+            <w:r>
+              <w:rPr>
+                <w:b/>
+                <w:bCs/>
+                <w:sz w:val="20"/>
+                <w:szCs w:val="20"/>
+                <w:lang w:val="en-IN"/>
+              </w:rPr>
+              <w:t>MBA) – University of California, Riverside</w:t>
+            </w:r>
+            <w:r>
+              <w:rPr>
+                <w:i/>
+                <w:iCs/>
+                <w:sz w:val="20"/>
+                <w:szCs w:val="20"/>
+                <w:lang w:val="en-IN"/>
+              </w:rPr>
+              <w:t xml:space="preserve"> GPA: 3.8 </w:t>
+            </w:r>
+            <w:r>
+              <w:rPr>
+                <w:i/>
+                <w:iCs/>
+                <w:sz w:val="20"/>
+                <w:szCs w:val="20"/>
+                <w:lang w:val="en-IN"/>
+              </w:rPr>
+              <w:t xml:space="preserve">                                       </w:t>
+            </w:r>
+            <w:r>
+              <w:rPr>
+                <w:b/>
+                <w:bCs/>
+                <w:sz w:val="20"/>
+                <w:szCs w:val="20"/>
+                <w:lang w:val="en-IN"/>
+              </w:rPr>
+              <w:t>June 2026</w:t>
             </w:r>
           </w:p>
           <w:p>
             <w:pPr>
-              <w:pStyle w:val="ListParagraph"/>
-              <w:numPr>
-                <w:ilvl w:val="0"/>
-                <w:numId w:val="27"/>
-              </w:numPr>
               <w:jc w:val="both"/>
               <w:rPr>
-                <w:rFonts w:cstheme="minorHAnsi"/>
                 <w:sz w:val="20"/>
                 <w:szCs w:val="20"/>
               </w:rPr>
             </w:pPr>
             <w:r>
               <w:rPr>
-                <w:rFonts w:cstheme="minorHAnsi"/>
-                <w:sz w:val="20"/>
-                <w:szCs w:val="20"/>
-              </w:rPr>
-              <w:t>Led a strategy consulting engagement analyzing manufacturing operations, inventory flows, and capacity constraints through process mapping and stakeholder interviews.</w:t>
-            </w:r>
-          </w:p>
-          <w:p>
-            <w:pPr>
-              <w:pStyle w:val="ListParagraph"/>
-              <w:numPr>
-                <w:ilvl w:val="0"/>
-                <w:numId w:val="27"/>
-              </w:numPr>
-              <w:jc w:val="both"/>
-              <w:rPr>
-                <w:rFonts w:cstheme="minorHAnsi"/>
-                <w:sz w:val="20"/>
-                <w:szCs w:val="20"/>
-              </w:rPr>
-            </w:pPr>
-            <w:r>
-              <w:rPr>
-                <w:rFonts w:cstheme="minorHAnsi"/>
-                <w:sz w:val="20"/>
-                <w:szCs w:val="20"/>
-              </w:rPr>
-              <w:t>Developed phased operational roadmaps, KPI frameworks, and executive recommendations improving scalability and operational efficiency.</w:t>
-            </w:r>
-          </w:p>
-          <w:p>
-            <w:r>
-              <w:rPr>
-                <w:rFonts w:cstheme="minorHAnsi"/>
                 <w:b/>
                 <w:bCs/>
                 <w:sz w:val="20"/>
                 <w:szCs w:val="20"/>
-              </w:rPr>
-              <w:t>UCR GSM Student Association | Professional Development Lead</w:t>
-            </w:r>
-          </w:p>
-          <w:p>
-            <w:pPr>
-              <w:pStyle w:val="ListParagraph"/>
-              <w:numPr>
-                <w:ilvl w:val="0"/>
-                <w:numId w:val="27"/>
-              </w:numPr>
-              <w:jc w:val="both"/>
-              <w:rPr>
-                <w:rFonts w:cstheme="minorHAnsi"/>
-                <w:sz w:val="20"/>
-                <w:szCs w:val="20"/>
-              </w:rPr>
-            </w:pPr>
-            <w:r>
-              <w:rPr>
-                <w:rFonts w:cstheme="minorHAnsi"/>
-                <w:sz w:val="20"/>
-                <w:szCs w:val="20"/>
-              </w:rPr>
-              <w:t>Launched the school's first newsletter and podcast, designing editorial strategy, distribution workflows, and performance dashboards that improved audience engagement.</w:t>
+                <w:lang w:val="en-IN"/>
+              </w:rPr>
+              <w:t>Bachelor of Technology, Biotechnology – Vellore Institute of Technology, India</w:t>
+            </w:r>
+            <w:r>
+              <w:rPr>
+                <w:i/>
+                <w:iCs/>
+                <w:sz w:val="20"/>
+                <w:szCs w:val="20"/>
+                <w:lang w:val="en-IN"/>
+              </w:rPr>
+              <w:t xml:space="preserve"> GPA:</w:t>
+            </w:r>
+            <w:r>
+              <w:rPr>
+                <w:i/>
+                <w:iCs/>
+                <w:sz w:val="20"/>
+                <w:szCs w:val="20"/>
+                <w:lang w:val="en-IN"/>
+              </w:rPr>
+              <w:t xml:space="preserve"> </w:t>
+            </w:r>
+            <w:r>
+              <w:rPr>
+                <w:i/>
+                <w:iCs/>
+                <w:sz w:val="20"/>
+                <w:szCs w:val="20"/>
+                <w:lang w:val="en-IN"/>
+              </w:rPr>
+              <w:t xml:space="preserve">3.5 </w:t>
+            </w:r>
+            <w:r>
+              <w:rPr>
+                <w:i/>
+                <w:iCs/>
+                <w:sz w:val="20"/>
+                <w:szCs w:val="20"/>
+                <w:lang w:val="en-IN"/>
+              </w:rPr>
+              <w:t xml:space="preserve"> </w:t>
+            </w:r>
+            <w:r>
+              <w:rPr>
+                <w:i/>
+                <w:iCs/>
+                <w:sz w:val="20"/>
+                <w:szCs w:val="20"/>
+                <w:lang w:val="en-IN"/>
+              </w:rPr>
+              <w:t xml:space="preserve">                                                   </w:t>
+            </w:r>
+            <w:r>
+              <w:rPr>
+                <w:b/>
+                <w:bCs/>
+                <w:sz w:val="20"/>
+                <w:szCs w:val="20"/>
+                <w:lang w:val="en-IN"/>
+              </w:rPr>
+              <w:t>Aug 2023</w:t>
             </w:r>
           </w:p>
         </w:tc>
       </w:tr>
       <w:tr>
+        <w:trPr>
+          <w:trHeight w:val="266"/>
+        </w:trPr>
         <w:tc>
           <w:tcPr>
             <w:tcW w:w="0" w:type="auto"/>
@@ -1080,18 +1595,17 @@
           <w:p>
             <w:pPr>
               <w:spacing w:before="120"/>
-              <w:rPr>
-                <w:rFonts w:cstheme="minorHAnsi"/>
-                <w:b/>
-                <w:bCs/>
-                <w:color w:val="2F5496" w:themeColor="accent1" w:themeShade="BF"/>
+              <w:jc w:val="both"/>
+              <w:rPr>
+                <w:rStyle w:val="IntenseReference"/>
+                <w:b w:val="0"/>
+                <w:bCs w:val="0"/>
                 <w:sz w:val="20"/>
                 <w:szCs w:val="20"/>
               </w:rPr>
             </w:pPr>
             <w:r>
               <w:rPr>
-                <w:rFonts w:cstheme="minorHAnsi"/>
                 <w:b/>
                 <w:bCs/>
                 <w:color w:val="2F5496" w:themeColor="accent1" w:themeShade="BF"/>
@@ -1108,93 +1622,67 @@
           <w:tcPr>
             <w:tcW w:w="0" w:type="auto"/>
             <w:gridSpan w:val="2"/>
+            <w:tcBorders>
+              <w:top w:val="single" w:sz="4" w:space="0" w:color="auto"/>
+            </w:tcBorders>
           </w:tcPr>
           <w:p>
             <w:pPr>
-              <w:pStyle w:val="ListParagraph"/>
-              <w:numPr>
-                <w:ilvl w:val="0"/>
-                <w:numId w:val="27"/>
-              </w:numPr>
               <w:jc w:val="both"/>
               <w:rPr>
-                <w:rFonts w:cstheme="minorHAnsi"/>
                 <w:sz w:val="20"/>
                 <w:szCs w:val="20"/>
               </w:rPr>
             </w:pPr>
             <w:r>
               <w:rPr>
-                <w:rFonts w:cstheme="minorHAnsi"/>
-                <w:sz w:val="20"/>
-                <w:szCs w:val="20"/>
-              </w:rPr>
-              <w:t>Beta Gamma Sigma Honor Society (Top 20% of MBA Class)</w:t>
+                <w:sz w:val="20"/>
+                <w:szCs w:val="20"/>
+              </w:rPr>
+              <w:t xml:space="preserve">Beta Gamma Sigma Honor Society (Top 20% of MBA Class) </w:t>
+            </w:r>
+            <w:r>
+              <w:rPr>
+                <w:sz w:val="20"/>
+                <w:szCs w:val="20"/>
+              </w:rPr>
+              <w:t>|</w:t>
+            </w:r>
+            <w:r>
+              <w:t xml:space="preserve"> </w:t>
+            </w:r>
+            <w:r>
+              <w:rPr>
+                <w:sz w:val="20"/>
+                <w:szCs w:val="20"/>
+              </w:rPr>
+              <w:t>Award for Best Graduate Teaching Assistant, Statistics</w:t>
             </w:r>
           </w:p>
           <w:p>
             <w:pPr>
-              <w:pStyle w:val="ListParagraph"/>
-              <w:numPr>
-                <w:ilvl w:val="0"/>
-                <w:numId w:val="27"/>
-              </w:numPr>
               <w:jc w:val="both"/>
               <w:rPr>
-                <w:rFonts w:cstheme="minorHAnsi"/>
                 <w:sz w:val="20"/>
                 <w:szCs w:val="20"/>
               </w:rPr>
             </w:pPr>
             <w:r>
               <w:rPr>
-                <w:rFonts w:cstheme="minorHAnsi"/>
                 <w:sz w:val="20"/>
                 <w:szCs w:val="20"/>
               </w:rPr>
               <w:t>2024 UCR Case Competition Winner</w:t>
             </w:r>
-          </w:p>
-          <w:p>
-            <w:pPr>
-              <w:pStyle w:val="ListParagraph"/>
-              <w:numPr>
-                <w:ilvl w:val="0"/>
-                <w:numId w:val="27"/>
-              </w:numPr>
-              <w:jc w:val="both"/>
-              <w:rPr>
-                <w:rFonts w:cstheme="minorHAnsi"/>
-                <w:sz w:val="20"/>
-                <w:szCs w:val="20"/>
-              </w:rPr>
-            </w:pPr>
-            <w:r>
-              <w:rPr>
-                <w:rFonts w:cstheme="minorHAnsi"/>
-                <w:sz w:val="20"/>
-                <w:szCs w:val="20"/>
-              </w:rPr>
-              <w:t>Award for Best Graduate Teaching Assistant, Statistics</w:t>
-            </w:r>
-          </w:p>
-          <w:p>
-            <w:pPr>
-              <w:pStyle w:val="ListParagraph"/>
-              <w:numPr>
-                <w:ilvl w:val="0"/>
-                <w:numId w:val="27"/>
-              </w:numPr>
-              <w:jc w:val="both"/>
-              <w:rPr>
-                <w:rFonts w:cstheme="minorHAnsi"/>
-                <w:sz w:val="20"/>
-                <w:szCs w:val="20"/>
-              </w:rPr>
-            </w:pPr>
-            <w:r>
-              <w:rPr>
-                <w:rFonts w:cstheme="minorHAnsi"/>
+            <w:r>
+              <w:rPr>
+                <w:sz w:val="20"/>
+                <w:szCs w:val="20"/>
+              </w:rPr>
+              <w:t xml:space="preserve"> | </w:t>
+            </w:r>
+            <w:r>
+              <w:rPr>
                 <w:sz w:val="20"/>
                 <w:szCs w:val="20"/>
               </w:rPr>
@@ -1206,7 +1694,8 @@
     </w:tbl>
     <w:p>
       <w:pPr>
-        <w:spacing w:line="240" w:lineRule="auto"/>
+        <w:spacing w:after="0" w:line="240" w:lineRule="auto"/>
+        <w:jc w:val="both"/>
         <w:rPr>
           <w:b/>
           <w:bCs/>
@@ -6261,6 +6750,9 @@
   </w:num>
   <w:num w:numId="42" w16cid:durableId="119232435">
     <w:abstractNumId w:val="13"/>
+  </w:num>
+  <w:num w:numId="43" w16cid:durableId="909465937">
+    <w:abstractNumId w:val="6"/>
   </w:num>
 </w:numbering>
 </file>

</xml_diff>

<commit_message>
Adopt business analyst resume template
</commit_message>
<xml_diff>
--- a/resume_engine/new_template.docx
+++ b/resume_engine/new_template.docx
@@ -18,14 +18,15 @@
         <w:tblLook w:val="04A0" w:firstRow="1" w:lastRow="0" w:firstColumn="1" w:lastColumn="0" w:noHBand="0" w:noVBand="1"/>
       </w:tblPr>
       <w:tblGrid>
-        <w:gridCol w:w="7986"/>
-        <w:gridCol w:w="2480"/>
+        <w:gridCol w:w="7387"/>
+        <w:gridCol w:w="184"/>
+        <w:gridCol w:w="2895"/>
       </w:tblGrid>
       <w:tr>
         <w:tc>
           <w:tcPr>
             <w:tcW w:w="0" w:type="auto"/>
-            <w:gridSpan w:val="2"/>
+            <w:gridSpan w:val="3"/>
           </w:tcPr>
           <w:p>
             <w:pPr>
@@ -52,7 +53,7 @@
         <w:tc>
           <w:tcPr>
             <w:tcW w:w="0" w:type="auto"/>
-            <w:gridSpan w:val="2"/>
+            <w:gridSpan w:val="3"/>
           </w:tcPr>
           <w:p>
             <w:pPr>
@@ -178,126 +179,7 @@
         <w:tc>
           <w:tcPr>
             <w:tcW w:w="0" w:type="auto"/>
-            <w:gridSpan w:val="2"/>
-            <w:tcBorders>
-              <w:bottom w:val="single" w:sz="4" w:space="0" w:color="auto"/>
-            </w:tcBorders>
-          </w:tcPr>
-          <w:p>
-            <w:pPr>
-              <w:spacing w:before="240"/>
-              <w:jc w:val="both"/>
-              <w:rPr>
-                <w:rFonts w:cstheme="minorHAnsi"/>
-                <w:b/>
-                <w:bCs/>
-                <w:sz w:val="20"/>
-                <w:szCs w:val="20"/>
-              </w:rPr>
-            </w:pPr>
-            <w:r>
-              <w:rPr>
-                <w:b/>
-                <w:bCs/>
-                <w:color w:val="2F5496" w:themeColor="accent1" w:themeShade="BF"/>
-                <w:sz w:val="20"/>
-                <w:szCs w:val="20"/>
-              </w:rPr>
-              <w:t>PROFESSIONAL SUMMARY</w:t>
-            </w:r>
-            <w:r>
-              <w:rPr>
-                <w:b/>
-                <w:bCs/>
-                <w:color w:val="2F5496" w:themeColor="accent1" w:themeShade="BF"/>
-                <w:sz w:val="20"/>
-                <w:szCs w:val="20"/>
-              </w:rPr>
-              <w:t xml:space="preserve"> </w:t>
-            </w:r>
-          </w:p>
-        </w:tc>
-      </w:tr>
-      <w:tr>
-        <w:tc>
-          <w:tcPr>
-            <w:tcW w:w="0" w:type="auto"/>
-            <w:gridSpan w:val="2"/>
-          </w:tcPr>
-          <w:p>
-            <w:pPr>
-              <w:jc w:val="both"/>
-              <w:rPr>
-                <w:rFonts w:cstheme="minorHAnsi"/>
-                <w:sz w:val="20"/>
-                <w:szCs w:val="20"/>
-                <w:lang w:val="en-IN"/>
-              </w:rPr>
-            </w:pPr>
-            <w:r>
-              <w:rPr>
-                <w:rFonts w:cstheme="minorHAnsi"/>
-                <w:sz w:val="20"/>
-                <w:szCs w:val="20"/>
-              </w:rPr>
-              <w:t>Strategy &amp; Operations</w:t>
-            </w:r>
-            <w:r>
-              <w:rPr>
-                <w:rFonts w:cstheme="minorHAnsi"/>
-                <w:sz w:val="20"/>
-                <w:szCs w:val="20"/>
-              </w:rPr>
-              <w:t xml:space="preserve"> </w:t>
-            </w:r>
-            <w:r>
-              <w:rPr>
-                <w:rFonts w:cstheme="minorHAnsi"/>
-                <w:sz w:val="20"/>
-                <w:szCs w:val="20"/>
-              </w:rPr>
-              <w:t xml:space="preserve">professional with an MBA and </w:t>
-            </w:r>
-            <w:r>
-              <w:rPr>
-                <w:rFonts w:cstheme="minorHAnsi"/>
-                <w:sz w:val="20"/>
-                <w:szCs w:val="20"/>
-              </w:rPr>
-              <w:t xml:space="preserve">3+ </w:t>
-            </w:r>
-            <w:r>
-              <w:rPr>
-                <w:rFonts w:cstheme="minorHAnsi"/>
-                <w:sz w:val="20"/>
-                <w:szCs w:val="20"/>
-              </w:rPr>
-              <w:t xml:space="preserve">of </w:t>
-            </w:r>
-            <w:r>
-              <w:rPr>
-                <w:rFonts w:cstheme="minorHAnsi"/>
-                <w:sz w:val="20"/>
-                <w:szCs w:val="20"/>
-              </w:rPr>
-              <w:t xml:space="preserve">experience solving complex business and operational problems across Hyundai Rotem, Thomson Reuters, Goldman Sachs, and startup environments </w:t>
-            </w:r>
-            <w:r>
-              <w:rPr>
-                <w:rFonts w:cstheme="minorHAnsi"/>
-                <w:sz w:val="20"/>
-                <w:szCs w:val="20"/>
-              </w:rPr>
-              <w:t>Combines process analysis, SQL and Excel reporting, cross-functional coordination, and AI-assisted problem-solving to improve workflows and translate data into practical business recommendations.</w:t>
-            </w:r>
-          </w:p>
-        </w:tc>
-      </w:tr>
-      <w:tr>
-        <w:tc>
-          <w:tcPr>
-            <w:tcW w:w="10466" w:type="dxa"/>
-            <w:gridSpan w:val="2"/>
+            <w:gridSpan w:val="3"/>
             <w:tcBorders>
               <w:bottom w:val="single" w:sz="4" w:space="0" w:color="auto"/>
             </w:tcBorders>
@@ -307,10 +189,9 @@
               <w:spacing w:before="120"/>
               <w:jc w:val="both"/>
               <w:rPr>
+                <w:rFonts w:cstheme="minorHAnsi"/>
                 <w:b/>
                 <w:bCs/>
-                <w:i/>
-                <w:iCs/>
                 <w:sz w:val="20"/>
                 <w:szCs w:val="20"/>
               </w:rPr>
@@ -323,7 +204,17 @@
                 <w:sz w:val="20"/>
                 <w:szCs w:val="20"/>
               </w:rPr>
-              <w:t xml:space="preserve">SKILLS </w:t>
+              <w:t>PROFESSIONAL SUMMARY</w:t>
+            </w:r>
+            <w:r>
+              <w:rPr>
+                <w:b/>
+                <w:bCs/>
+                <w:color w:val="2F5496" w:themeColor="accent1" w:themeShade="BF"/>
+                <w:sz w:val="20"/>
+                <w:szCs w:val="20"/>
+              </w:rPr>
+              <w:t xml:space="preserve"> </w:t>
             </w:r>
           </w:p>
         </w:tc>
@@ -332,15 +223,13 @@
         <w:tc>
           <w:tcPr>
             <w:tcW w:w="0" w:type="auto"/>
-            <w:gridSpan w:val="2"/>
-            <w:tcBorders>
-              <w:top w:val="single" w:sz="4" w:space="0" w:color="auto"/>
-            </w:tcBorders>
+            <w:gridSpan w:val="3"/>
           </w:tcPr>
           <w:p>
             <w:pPr>
               <w:jc w:val="both"/>
               <w:rPr>
+                <w:rFonts w:cstheme="minorHAnsi"/>
                 <w:sz w:val="20"/>
                 <w:szCs w:val="20"/>
                 <w:lang w:val="en-IN"/>
@@ -348,111 +237,43 @@
             </w:pPr>
             <w:r>
               <w:rPr>
-                <w:b/>
-                <w:bCs/>
-                <w:sz w:val="20"/>
-                <w:szCs w:val="20"/>
-                <w:lang w:val="en-IN"/>
-              </w:rPr>
-              <w:t>Analytics &amp; Reporting:</w:t>
-            </w:r>
-            <w:r>
-              <w:rPr>
-                <w:sz w:val="20"/>
-                <w:szCs w:val="20"/>
-                <w:lang w:val="en-IN"/>
-              </w:rPr>
-              <w:t xml:space="preserve"> SQL, Advanced Excel, Power Query, Data Validation, Reconciliation, Variance Analysis, KPI Dashboards</w:t>
-            </w:r>
-          </w:p>
-          <w:p>
-            <w:pPr>
-              <w:jc w:val="both"/>
-              <w:rPr>
-                <w:sz w:val="20"/>
-                <w:szCs w:val="20"/>
-                <w:lang w:val="en-IN"/>
-              </w:rPr>
-            </w:pPr>
-            <w:r>
-              <w:rPr>
-                <w:b/>
-                <w:bCs/>
-                <w:sz w:val="20"/>
-                <w:szCs w:val="20"/>
-                <w:lang w:val="en-IN"/>
-              </w:rPr>
-              <w:t>Platforms:</w:t>
-            </w:r>
-            <w:r>
-              <w:rPr>
-                <w:sz w:val="20"/>
-                <w:szCs w:val="20"/>
-                <w:lang w:val="en-IN"/>
-              </w:rPr>
-              <w:t xml:space="preserve"> Tableau, Qlik Sense, Power BI, SharePoint, SAP Ariba, JIRA, Salesforce, PowerPoint</w:t>
-            </w:r>
-            <w:r>
-              <w:rPr>
-                <w:sz w:val="20"/>
-                <w:szCs w:val="20"/>
-                <w:lang w:val="en-IN"/>
-              </w:rPr>
-              <w:t xml:space="preserve">, Snowflake </w:t>
-            </w:r>
-          </w:p>
-          <w:p>
-            <w:pPr>
-              <w:jc w:val="both"/>
-              <w:rPr>
-                <w:sz w:val="20"/>
-                <w:szCs w:val="20"/>
-                <w:lang w:val="en-IN"/>
-              </w:rPr>
-            </w:pPr>
-            <w:r>
-              <w:rPr>
-                <w:b/>
-                <w:bCs/>
-                <w:sz w:val="20"/>
-                <w:szCs w:val="20"/>
-                <w:lang w:val="en-IN"/>
-              </w:rPr>
-              <w:t>AI &amp; Automation:</w:t>
-            </w:r>
-            <w:r>
-              <w:rPr>
-                <w:sz w:val="20"/>
-                <w:szCs w:val="20"/>
-                <w:lang w:val="en-IN"/>
-              </w:rPr>
-              <w:t xml:space="preserve"> Claude, ChatGPT, Excel Copilot, Gemini, n8n, AI-Assisted Research and Documentation</w:t>
-            </w:r>
-            <w:r>
-              <w:rPr>
-                <w:sz w:val="20"/>
-                <w:szCs w:val="20"/>
-                <w:lang w:val="en-IN"/>
-              </w:rPr>
-              <w:br/>
-            </w:r>
-            <w:r>
-              <w:rPr>
-                <w:b/>
-                <w:bCs/>
-                <w:sz w:val="20"/>
-                <w:szCs w:val="20"/>
-                <w:lang w:val="en-IN"/>
-              </w:rPr>
-              <w:t>Business Analysis:</w:t>
-            </w:r>
-            <w:r>
-              <w:rPr>
-                <w:sz w:val="20"/>
-                <w:szCs w:val="20"/>
-                <w:lang w:val="en-IN"/>
-              </w:rPr>
-              <w:t xml:space="preserve"> Requirements Gathering, Process Mapping, Root-Cause Analysis, Workflow Improvement, SOP Documentation, UAT Support</w:t>
+                <w:rFonts w:cstheme="minorHAnsi"/>
+                <w:sz w:val="20"/>
+                <w:szCs w:val="20"/>
+              </w:rPr>
+              <w:t xml:space="preserve">MBA graduate </w:t>
+            </w:r>
+            <w:r>
+              <w:rPr>
+                <w:rFonts w:cstheme="minorHAnsi"/>
+                <w:sz w:val="20"/>
+                <w:szCs w:val="20"/>
+              </w:rPr>
+              <w:t xml:space="preserve">with </w:t>
+            </w:r>
+            <w:r>
+              <w:rPr>
+                <w:rFonts w:cstheme="minorHAnsi"/>
+                <w:sz w:val="20"/>
+                <w:szCs w:val="20"/>
+              </w:rPr>
+              <w:t>experience across financial services, global operations,</w:t>
+            </w:r>
+            <w:r>
+              <w:rPr>
+                <w:rFonts w:cstheme="minorHAnsi"/>
+                <w:sz w:val="20"/>
+                <w:szCs w:val="20"/>
+              </w:rPr>
+              <w:t xml:space="preserve"> digital </w:t>
+            </w:r>
+            <w:r>
+              <w:rPr>
+                <w:rFonts w:cstheme="minorHAnsi"/>
+                <w:sz w:val="20"/>
+                <w:szCs w:val="20"/>
+              </w:rPr>
+              <w:t>product, and startup environments. Experienced in requirements gathering, workflow analysis, Agile delivery, UAT, and translating stakeholder needs into process improvements and actionable recommendations using JIRA, SQL, Excel, Tableau, and Power BI.</w:t>
             </w:r>
           </w:p>
         </w:tc>
@@ -464,7 +285,7 @@
         <w:tc>
           <w:tcPr>
             <w:tcW w:w="10466" w:type="dxa"/>
-            <w:gridSpan w:val="2"/>
+            <w:gridSpan w:val="3"/>
             <w:tcBorders>
               <w:bottom w:val="single" w:sz="4" w:space="0" w:color="auto"/>
             </w:tcBorders>
@@ -510,7 +331,7 @@
         </w:trPr>
         <w:tc>
           <w:tcPr>
-            <w:tcW w:w="8080" w:type="dxa"/>
+            <w:tcW w:w="7412" w:type="dxa"/>
           </w:tcPr>
           <w:p>
             <w:pPr>
@@ -547,8 +368,9 @@
                 <w:sz w:val="20"/>
                 <w:szCs w:val="20"/>
               </w:rPr>
-              <w:t>Strategy &amp; Operations</w:t>
-            </w:r>
+              <w:t xml:space="preserve">Business </w:t>
+            </w:r>
+            <w:proofErr w:type="gramStart"/>
             <w:r>
               <w:rPr>
                 <w:b/>
@@ -556,7 +378,7 @@
                 <w:sz w:val="20"/>
                 <w:szCs w:val="20"/>
               </w:rPr>
-              <w:t xml:space="preserve"> </w:t>
+              <w:t xml:space="preserve">Analyst, </w:t>
             </w:r>
             <w:r>
               <w:rPr>
@@ -565,7 +387,7 @@
                 <w:sz w:val="20"/>
                 <w:szCs w:val="20"/>
               </w:rPr>
-              <w:t xml:space="preserve">Consultant, </w:t>
+              <w:t xml:space="preserve"> </w:t>
             </w:r>
             <w:r>
               <w:rPr>
@@ -574,13 +396,24 @@
                 <w:sz w:val="20"/>
                 <w:szCs w:val="20"/>
               </w:rPr>
-              <w:t>MBA Client Engagement</w:t>
+              <w:t>MBA</w:t>
+            </w:r>
+            <w:proofErr w:type="gramEnd"/>
+            <w:r>
+              <w:rPr>
+                <w:b/>
+                <w:bCs/>
+                <w:sz w:val="20"/>
+                <w:szCs w:val="20"/>
+              </w:rPr>
+              <w:t xml:space="preserve"> Client Engagement</w:t>
             </w:r>
           </w:p>
         </w:tc>
         <w:tc>
           <w:tcPr>
-            <w:tcW w:w="2386" w:type="dxa"/>
+            <w:tcW w:w="3054" w:type="dxa"/>
+            <w:gridSpan w:val="2"/>
           </w:tcPr>
           <w:p>
             <w:pPr>
@@ -592,6 +425,15 @@
                 <w:szCs w:val="20"/>
               </w:rPr>
             </w:pPr>
+            <w:r>
+              <w:rPr>
+                <w:b/>
+                <w:bCs/>
+                <w:sz w:val="20"/>
+                <w:szCs w:val="20"/>
+              </w:rPr>
+              <w:t xml:space="preserve"> </w:t>
+            </w:r>
             <w:r>
               <w:rPr>
                 <w:b/>
@@ -611,7 +453,7 @@
         <w:tc>
           <w:tcPr>
             <w:tcW w:w="10466" w:type="dxa"/>
-            <w:gridSpan w:val="2"/>
+            <w:gridSpan w:val="3"/>
           </w:tcPr>
           <w:p>
             <w:pPr>
@@ -631,7 +473,21 @@
                 <w:sz w:val="20"/>
                 <w:szCs w:val="20"/>
               </w:rPr>
-              <w:t>Mapped manufacturing, inventory, testing, and material-flow processes through facility assessments, stakeholder interviews, and workflow analysis to identify operational bottlenecks.</w:t>
+              <w:t xml:space="preserve">Conducted </w:t>
+            </w:r>
+            <w:r>
+              <w:rPr>
+                <w:sz w:val="20"/>
+                <w:szCs w:val="20"/>
+              </w:rPr>
+              <w:t>requirements gathering and process mapping across manufacturing, inventory, and material-flow operations, interviewing plant leadership and floor technicians to document current-state workflows and pinpoint root-cause bottlenecks</w:t>
+            </w:r>
+            <w:r>
+              <w:rPr>
+                <w:sz w:val="20"/>
+                <w:szCs w:val="20"/>
+              </w:rPr>
+              <w:t>.</w:t>
             </w:r>
           </w:p>
           <w:p>
@@ -652,7 +508,14 @@
                 <w:sz w:val="20"/>
                 <w:szCs w:val="20"/>
               </w:rPr>
-              <w:t>Quantified constraints including 145 meters of material travel, 24–32 hours of weekly idle test capacity, and space limitations affecting technician expansion from 12 to 35.</w:t>
+              <w:t>Evaluated future-state process options, including FIFO workflows, dedicated testing zones, and improved shipping layouts, translating floor-level constraints such as 145 meters of material travel, 24 to 32 hours of weekly idle test capacity, and space limits blocking technician growth from 12 to 35 into a data-backed business case</w:t>
+            </w:r>
+            <w:r>
+              <w:rPr>
+                <w:sz w:val="20"/>
+                <w:szCs w:val="20"/>
+              </w:rPr>
+              <w:t>.</w:t>
             </w:r>
           </w:p>
           <w:p>
@@ -673,14 +536,160 @@
                 <w:sz w:val="20"/>
                 <w:szCs w:val="20"/>
               </w:rPr>
-              <w:t>Deployed</w:t>
-            </w:r>
-            <w:r>
-              <w:rPr>
-                <w:sz w:val="20"/>
-                <w:szCs w:val="20"/>
-              </w:rPr>
-              <w:t xml:space="preserve"> Claude to synthesize stakeholder inputs, structure root-cause analysis, and evaluate four future-state operating scenarios involving FIFO workflows, dedicated testing zones, and improved shipping layouts.</w:t>
+              <w:t>Built a KPI framework and authored a six-month, $260K implementation roadmap projected to double throughput, support 2 to 3 weekly shipments, and deliver 18-month payback, presenting recommendations directly to plant leadership</w:t>
+            </w:r>
+            <w:r>
+              <w:rPr>
+                <w:sz w:val="20"/>
+                <w:szCs w:val="20"/>
+              </w:rPr>
+              <w:t>.</w:t>
+            </w:r>
+          </w:p>
+        </w:tc>
+      </w:tr>
+      <w:tr>
+        <w:trPr>
+          <w:trHeight w:val="215"/>
+        </w:trPr>
+        <w:tc>
+          <w:tcPr>
+            <w:tcW w:w="7586" w:type="dxa"/>
+            <w:gridSpan w:val="2"/>
+          </w:tcPr>
+          <w:p>
+            <w:pPr>
+              <w:spacing w:before="60"/>
+              <w:jc w:val="both"/>
+              <w:rPr>
+                <w:b/>
+                <w:bCs/>
+                <w:sz w:val="20"/>
+                <w:szCs w:val="20"/>
+              </w:rPr>
+            </w:pPr>
+            <w:r>
+              <w:rPr>
+                <w:b/>
+                <w:bCs/>
+                <w:sz w:val="20"/>
+                <w:szCs w:val="20"/>
+              </w:rPr>
+              <w:t>BB Wellness</w:t>
+            </w:r>
+            <w:r>
+              <w:rPr>
+                <w:b/>
+                <w:bCs/>
+                <w:sz w:val="20"/>
+                <w:szCs w:val="20"/>
+              </w:rPr>
+              <w:t xml:space="preserve"> </w:t>
+            </w:r>
+            <w:r>
+              <w:rPr>
+                <w:b/>
+                <w:bCs/>
+                <w:sz w:val="20"/>
+                <w:szCs w:val="20"/>
+              </w:rPr>
+              <w:t>|</w:t>
+            </w:r>
+            <w:r>
+              <w:rPr>
+                <w:b/>
+                <w:bCs/>
+                <w:sz w:val="20"/>
+                <w:szCs w:val="20"/>
+              </w:rPr>
+              <w:t xml:space="preserve"> </w:t>
+            </w:r>
+            <w:r>
+              <w:rPr>
+                <w:b/>
+                <w:bCs/>
+                <w:sz w:val="20"/>
+                <w:szCs w:val="20"/>
+              </w:rPr>
+              <w:t>Business Analyst – Product &amp; Marketing Operations</w:t>
+            </w:r>
+          </w:p>
+        </w:tc>
+        <w:tc>
+          <w:tcPr>
+            <w:tcW w:w="2880" w:type="dxa"/>
+          </w:tcPr>
+          <w:p>
+            <w:pPr>
+              <w:spacing w:before="60"/>
+              <w:jc w:val="right"/>
+              <w:rPr>
+                <w:b/>
+                <w:bCs/>
+                <w:sz w:val="20"/>
+                <w:szCs w:val="20"/>
+              </w:rPr>
+            </w:pPr>
+            <w:r>
+              <w:rPr>
+                <w:b/>
+                <w:bCs/>
+                <w:sz w:val="20"/>
+                <w:szCs w:val="20"/>
+              </w:rPr>
+              <w:t xml:space="preserve">  </w:t>
+            </w:r>
+            <w:r>
+              <w:rPr>
+                <w:b/>
+                <w:bCs/>
+                <w:sz w:val="20"/>
+                <w:szCs w:val="20"/>
+              </w:rPr>
+              <w:t>Feb 2025 – Sep 2025</w:t>
+            </w:r>
+          </w:p>
+        </w:tc>
+      </w:tr>
+      <w:tr>
+        <w:tc>
+          <w:tcPr>
+            <w:tcW w:w="0" w:type="auto"/>
+            <w:gridSpan w:val="3"/>
+          </w:tcPr>
+          <w:p>
+            <w:pPr>
+              <w:pStyle w:val="ListParagraph"/>
+              <w:numPr>
+                <w:ilvl w:val="0"/>
+                <w:numId w:val="27"/>
+              </w:numPr>
+              <w:jc w:val="both"/>
+              <w:rPr>
+                <w:sz w:val="20"/>
+                <w:szCs w:val="20"/>
+              </w:rPr>
+            </w:pPr>
+            <w:r>
+              <w:rPr>
+                <w:sz w:val="20"/>
+                <w:szCs w:val="20"/>
+              </w:rPr>
+              <w:t>Supported requirements gathering between business stakeholders and UI/UX designers</w:t>
+            </w:r>
+            <w:r>
+              <w:rPr>
+                <w:sz w:val="20"/>
+                <w:szCs w:val="20"/>
+              </w:rPr>
+              <w:t xml:space="preserve"> </w:t>
+            </w:r>
+            <w:r>
+              <w:rPr>
+                <w:sz w:val="20"/>
+                <w:szCs w:val="20"/>
+              </w:rPr>
+              <w:t>for a new mental health application, translating product needs into user stories in JIRA.</w:t>
             </w:r>
           </w:p>
           <w:p>
@@ -692,9 +701,6 @@
               </w:numPr>
               <w:jc w:val="both"/>
               <w:rPr>
-                <w:b/>
-                <w:bCs/>
-                <w:color w:val="2F5496" w:themeColor="accent1" w:themeShade="BF"/>
                 <w:sz w:val="20"/>
                 <w:szCs w:val="20"/>
               </w:rPr>
@@ -704,21 +710,78 @@
                 <w:sz w:val="20"/>
                 <w:szCs w:val="20"/>
               </w:rPr>
-              <w:t>Built a KPI framework and six-month implementation roadmap under $260K, projected to support 2x throughput, 2–3 weekly shipments, and payback within 18 months.</w:t>
+              <w:t xml:space="preserve">Documented requirements, workflows, and product decisions in Confluence to align business, design, </w:t>
+            </w:r>
+            <w:r>
+              <w:rPr>
+                <w:sz w:val="20"/>
+                <w:szCs w:val="20"/>
+              </w:rPr>
+              <w:t>&amp;</w:t>
+            </w:r>
+            <w:r>
+              <w:rPr>
+                <w:sz w:val="20"/>
+                <w:szCs w:val="20"/>
+              </w:rPr>
+              <w:t xml:space="preserve"> development teams.</w:t>
+            </w:r>
+          </w:p>
+          <w:p>
+            <w:pPr>
+              <w:pStyle w:val="ListParagraph"/>
+              <w:numPr>
+                <w:ilvl w:val="0"/>
+                <w:numId w:val="27"/>
+              </w:numPr>
+              <w:jc w:val="both"/>
+              <w:rPr>
+                <w:sz w:val="20"/>
+                <w:szCs w:val="20"/>
+                <w:lang w:val="en-IN"/>
+              </w:rPr>
+            </w:pPr>
+            <w:r>
+              <w:rPr>
+                <w:sz w:val="20"/>
+                <w:szCs w:val="20"/>
+              </w:rPr>
+              <w:t>Built KPI trackers across four marketing channels, improving on-time posting consistency by approximately 35% and strengthening performance visibility.</w:t>
+            </w:r>
+          </w:p>
+          <w:p>
+            <w:pPr>
+              <w:pStyle w:val="ListParagraph"/>
+              <w:numPr>
+                <w:ilvl w:val="0"/>
+                <w:numId w:val="27"/>
+              </w:numPr>
+              <w:jc w:val="both"/>
+              <w:rPr>
+                <w:sz w:val="20"/>
+                <w:szCs w:val="20"/>
+                <w:lang w:val="en-IN"/>
+              </w:rPr>
+            </w:pPr>
+            <w:r>
+              <w:rPr>
+                <w:sz w:val="20"/>
+                <w:szCs w:val="20"/>
+              </w:rPr>
+              <w:t>Used Copilot and Claude to streamline competitive research and accelerate recurring business reporting and documentation.</w:t>
             </w:r>
           </w:p>
         </w:tc>
       </w:tr>
       <w:tr>
-        <w:trPr>
-          <w:trHeight w:val="215"/>
-        </w:trPr>
         <w:tc>
           <w:tcPr>
-            <w:tcW w:w="8080" w:type="dxa"/>
+            <w:tcW w:w="7586" w:type="dxa"/>
+            <w:gridSpan w:val="2"/>
           </w:tcPr>
           <w:p>
             <w:pPr>
+              <w:spacing w:before="60"/>
               <w:jc w:val="both"/>
               <w:rPr>
                 <w:b/>
@@ -734,7 +797,7 @@
                 <w:sz w:val="20"/>
                 <w:szCs w:val="20"/>
               </w:rPr>
-              <w:t>BB Wellness</w:t>
+              <w:t xml:space="preserve">Thomson Reuters | </w:t>
             </w:r>
             <w:r>
               <w:rPr>
@@ -743,93 +806,21 @@
                 <w:sz w:val="20"/>
                 <w:szCs w:val="20"/>
               </w:rPr>
-              <w:t xml:space="preserve"> </w:t>
-            </w:r>
-            <w:r>
-              <w:rPr>
-                <w:b/>
-                <w:bCs/>
-                <w:sz w:val="20"/>
-                <w:szCs w:val="20"/>
-              </w:rPr>
-              <w:t>|</w:t>
-            </w:r>
-            <w:r>
-              <w:rPr>
-                <w:b/>
-                <w:bCs/>
-                <w:sz w:val="20"/>
-                <w:szCs w:val="20"/>
-              </w:rPr>
-              <w:t xml:space="preserve"> </w:t>
-            </w:r>
-            <w:r>
-              <w:rPr>
-                <w:b/>
-                <w:bCs/>
-                <w:sz w:val="20"/>
-                <w:szCs w:val="20"/>
-              </w:rPr>
-              <w:t>Analyst</w:t>
-            </w:r>
-            <w:r>
-              <w:rPr>
-                <w:b/>
-                <w:bCs/>
-                <w:sz w:val="20"/>
-                <w:szCs w:val="20"/>
-              </w:rPr>
-              <w:t xml:space="preserve"> </w:t>
-            </w:r>
-            <w:r>
-              <w:rPr>
-                <w:b/>
-                <w:bCs/>
-                <w:sz w:val="20"/>
-                <w:szCs w:val="20"/>
-              </w:rPr>
-              <w:t>–</w:t>
-            </w:r>
-            <w:r>
-              <w:rPr>
-                <w:b/>
-                <w:bCs/>
-                <w:sz w:val="20"/>
-                <w:szCs w:val="20"/>
-              </w:rPr>
-              <w:t xml:space="preserve"> </w:t>
-            </w:r>
-            <w:r>
-              <w:rPr>
-                <w:b/>
-                <w:bCs/>
-                <w:sz w:val="20"/>
-                <w:szCs w:val="20"/>
-              </w:rPr>
-              <w:t>Strategy &amp; Operations</w:t>
-            </w:r>
-            <w:r>
-              <w:rPr>
-                <w:b/>
-                <w:bCs/>
-                <w:sz w:val="20"/>
-                <w:szCs w:val="20"/>
-              </w:rPr>
-              <w:t xml:space="preserve">                           </w:t>
+              <w:t>Business Analyst – Global Operations</w:t>
             </w:r>
           </w:p>
         </w:tc>
         <w:tc>
           <w:tcPr>
-            <w:tcW w:w="2386" w:type="dxa"/>
+            <w:tcW w:w="2880" w:type="dxa"/>
           </w:tcPr>
           <w:p>
             <w:pPr>
+              <w:spacing w:before="60"/>
               <w:jc w:val="right"/>
               <w:rPr>
                 <w:b/>
                 <w:bCs/>
-                <w:color w:val="2F5496" w:themeColor="accent1" w:themeShade="BF"/>
                 <w:sz w:val="20"/>
                 <w:szCs w:val="20"/>
               </w:rPr>
@@ -841,7 +832,7 @@
                 <w:sz w:val="20"/>
                 <w:szCs w:val="20"/>
               </w:rPr>
-              <w:t>Feb 2025 – Sep 2025</w:t>
+              <w:t>Oct 2023 – Jun 2024</w:t>
             </w:r>
           </w:p>
         </w:tc>
@@ -850,7 +841,7 @@
         <w:tc>
           <w:tcPr>
             <w:tcW w:w="0" w:type="auto"/>
-            <w:gridSpan w:val="2"/>
+            <w:gridSpan w:val="3"/>
           </w:tcPr>
           <w:p>
             <w:pPr>
@@ -863,16 +854,14 @@
               <w:rPr>
                 <w:sz w:val="20"/>
                 <w:szCs w:val="20"/>
-                <w:lang w:val="en-IN"/>
               </w:rPr>
             </w:pPr>
             <w:r>
               <w:rPr>
                 <w:sz w:val="20"/>
                 <w:szCs w:val="20"/>
-                <w:lang w:val="en-IN"/>
-              </w:rPr>
-              <w:t>Analyzed campaign performance and competitive activity across 20+ companies, delivering positioning and growth recommendations to leadership.</w:t>
+              </w:rPr>
+              <w:t>Supported Agile/Scrum backlog management and UAT activities in JIRA, partnering with cross-functional teams to clarify operational requirements and help translate them into user stories and acceptance criteria.</w:t>
             </w:r>
           </w:p>
           <w:p>
@@ -886,16 +875,14 @@
               <w:rPr>
                 <w:sz w:val="20"/>
                 <w:szCs w:val="20"/>
-                <w:lang w:val="en-IN"/>
               </w:rPr>
             </w:pPr>
             <w:r>
               <w:rPr>
                 <w:sz w:val="20"/>
                 <w:szCs w:val="20"/>
-                <w:lang w:val="en-IN"/>
-              </w:rPr>
-              <w:t>Built Excel-based KPI trackers across four marketing channels and managed social scheduling via Buffer, improving on-time posting consistency by roughly 35% and giving leadership clearer visibility into channel performance.</w:t>
+              </w:rPr>
+              <w:t>Supported UAT by validating reports and process outputs against business requirements, documenting issues, coordinating stakeholder feedback, and assisting with corrections and retesting.</w:t>
             </w:r>
           </w:p>
           <w:p>
@@ -915,9 +902,50 @@
               <w:rPr>
                 <w:sz w:val="20"/>
                 <w:szCs w:val="20"/>
-                <w:lang w:val="en-IN"/>
-              </w:rPr>
-              <w:t>Coordinated 10+ cross-functional initiatives and supported outreach to 15+ prospective angel investors, using Claude and ChatGPT to speed up research and reporting along the way.</w:t>
+              </w:rPr>
+              <w:t>Mapped current-state processes, developed SOPs, and translated root-cause findings into executive reports supporting process standardization, governance, and automation initiatives.</w:t>
+            </w:r>
+          </w:p>
+          <w:p>
+            <w:pPr>
+              <w:pStyle w:val="ListParagraph"/>
+              <w:numPr>
+                <w:ilvl w:val="0"/>
+                <w:numId w:val="27"/>
+              </w:numPr>
+              <w:jc w:val="both"/>
+              <w:rPr>
+                <w:sz w:val="20"/>
+                <w:szCs w:val="20"/>
+              </w:rPr>
+            </w:pPr>
+            <w:r>
+              <w:rPr>
+                <w:sz w:val="20"/>
+                <w:szCs w:val="20"/>
+              </w:rPr>
+              <w:t>Analyzed Paris Olympics budget versus actuals using SQL joins and Excel across vendor, purchase-order, and expense data, identifying areas of overspending and underspending for stakeholder action.</w:t>
+            </w:r>
+          </w:p>
+          <w:p>
+            <w:pPr>
+              <w:pStyle w:val="ListParagraph"/>
+              <w:numPr>
+                <w:ilvl w:val="0"/>
+                <w:numId w:val="27"/>
+              </w:numPr>
+              <w:jc w:val="both"/>
+              <w:rPr>
+                <w:sz w:val="20"/>
+                <w:szCs w:val="20"/>
+              </w:rPr>
+            </w:pPr>
+            <w:r>
+              <w:rPr>
+                <w:sz w:val="20"/>
+                <w:szCs w:val="20"/>
+              </w:rPr>
+              <w:t>Migrated a manual, error-prone Excel case tracker to a centralized SharePoint dashboard across three global business units, reducing version-control issues by approximately 30% and giving managers real-time visibility into case ownership and status.</w:t>
             </w:r>
           </w:p>
         </w:tc>
@@ -925,10 +953,12 @@
       <w:tr>
         <w:tc>
           <w:tcPr>
-            <w:tcW w:w="8080" w:type="dxa"/>
+            <w:tcW w:w="7586" w:type="dxa"/>
+            <w:gridSpan w:val="2"/>
           </w:tcPr>
           <w:p>
             <w:pPr>
+              <w:spacing w:before="60"/>
               <w:jc w:val="both"/>
               <w:rPr>
                 <w:b/>
@@ -944,7 +974,7 @@
                 <w:sz w:val="20"/>
                 <w:szCs w:val="20"/>
               </w:rPr>
-              <w:t xml:space="preserve">Thomson Reuters | Analyst – Global </w:t>
+              <w:t>Goldm</w:t>
             </w:r>
             <w:r>
               <w:rPr>
@@ -953,17 +983,54 @@
                 <w:sz w:val="20"/>
                 <w:szCs w:val="20"/>
               </w:rPr>
-              <w:t>Strategy &amp; Operations</w:t>
+              <w:t>a</w:t>
+            </w:r>
+            <w:r>
+              <w:rPr>
+                <w:b/>
+                <w:bCs/>
+                <w:sz w:val="20"/>
+                <w:szCs w:val="20"/>
+              </w:rPr>
+              <w:t xml:space="preserve">n Sachs | STEM </w:t>
+            </w:r>
+            <w:r>
+              <w:rPr>
+                <w:b/>
+                <w:bCs/>
+                <w:sz w:val="20"/>
+                <w:szCs w:val="20"/>
+              </w:rPr>
+              <w:t>Analyst</w:t>
+            </w:r>
+            <w:r>
+              <w:rPr>
+                <w:b/>
+                <w:bCs/>
+                <w:sz w:val="20"/>
+                <w:szCs w:val="20"/>
+              </w:rPr>
+              <w:t xml:space="preserve"> – Asset &amp; Wealth Management</w:t>
+            </w:r>
+            <w:r>
+              <w:rPr>
+                <w:b/>
+                <w:bCs/>
+                <w:sz w:val="20"/>
+                <w:szCs w:val="20"/>
+              </w:rPr>
+              <w:tab/>
             </w:r>
           </w:p>
         </w:tc>
         <w:tc>
           <w:tcPr>
-            <w:tcW w:w="2386" w:type="dxa"/>
+            <w:tcW w:w="2880" w:type="dxa"/>
           </w:tcPr>
           <w:p>
             <w:pPr>
-              <w:jc w:val="right"/>
+              <w:spacing w:before="60"/>
+              <w:jc w:val="both"/>
               <w:rPr>
                 <w:b/>
                 <w:bCs/>
@@ -978,7 +1045,34 @@
                 <w:sz w:val="20"/>
                 <w:szCs w:val="20"/>
               </w:rPr>
-              <w:t>Oct 2023 – Jun 2024</w:t>
+              <w:t xml:space="preserve">   </w:t>
+            </w:r>
+            <w:r>
+              <w:rPr>
+                <w:b/>
+                <w:bCs/>
+                <w:sz w:val="20"/>
+                <w:szCs w:val="20"/>
+              </w:rPr>
+              <w:t xml:space="preserve">          </w:t>
+            </w:r>
+            <w:r>
+              <w:rPr>
+                <w:b/>
+                <w:bCs/>
+                <w:sz w:val="20"/>
+                <w:szCs w:val="20"/>
+              </w:rPr>
+              <w:t xml:space="preserve">          </w:t>
+            </w:r>
+            <w:r>
+              <w:rPr>
+                <w:b/>
+                <w:bCs/>
+                <w:sz w:val="20"/>
+                <w:szCs w:val="20"/>
+              </w:rPr>
+              <w:t>Feb 2023 – Jun 2023</w:t>
             </w:r>
           </w:p>
         </w:tc>
@@ -987,7 +1081,7 @@
         <w:tc>
           <w:tcPr>
             <w:tcW w:w="0" w:type="auto"/>
-            <w:gridSpan w:val="2"/>
+            <w:gridSpan w:val="3"/>
           </w:tcPr>
           <w:p>
             <w:pPr>
@@ -1007,7 +1101,7 @@
                 <w:sz w:val="20"/>
                 <w:szCs w:val="20"/>
               </w:rPr>
-              <w:t>Analyzed Paris Olympics budget versus actuals using SQL joins and Excel across vendor, purchase-order, and expense data, identifying overspend and underspend for stakeholder action.</w:t>
+              <w:t>Supported the gathering and documentation of business requirements for Client Revenue Operations and Institutional Reporting workflows using JIRA, Excel, and Qlik Sense.</w:t>
             </w:r>
           </w:p>
           <w:p>
@@ -1028,7 +1122,7 @@
                 <w:sz w:val="20"/>
                 <w:szCs w:val="20"/>
               </w:rPr>
-              <w:t>Migrated a manual, error-prone Excel case tracker to a centralized SharePoint dashboard across three global business units, cutting version-control errors by roughly 30% and giving managers real-time visibility into case ownership and status.</w:t>
+              <w:t>Analyzed current-state reporting workflows, identified manual dependencies and process gaps, and recommended automation opportunities to strengthen operational controls and reporting consistency.</w:t>
             </w:r>
           </w:p>
           <w:p>
@@ -1049,7 +1143,28 @@
                 <w:sz w:val="20"/>
                 <w:szCs w:val="20"/>
               </w:rPr>
-              <w:t>Validated SAP Ariba transactions, reconciled financial and operational records, and partnered with finance, procurement, and operations teams to resolve workflow discrepancies.</w:t>
+              <w:t>Developed operational trackers to monitor</w:t>
+            </w:r>
+            <w:r>
+              <w:rPr>
+                <w:sz w:val="20"/>
+                <w:szCs w:val="20"/>
+              </w:rPr>
+              <w:t xml:space="preserve"> </w:t>
+            </w:r>
+            <w:r>
+              <w:rPr>
+                <w:sz w:val="20"/>
+                <w:szCs w:val="20"/>
+              </w:rPr>
+              <w:t>client commitments, improving workflow transparency and reporting consistenc</w:t>
+            </w:r>
+            <w:r>
+              <w:rPr>
+                <w:sz w:val="20"/>
+                <w:szCs w:val="20"/>
+              </w:rPr>
+              <w:t>y.</w:t>
             </w:r>
           </w:p>
           <w:p>
@@ -1070,7 +1185,7 @@
                 <w:sz w:val="20"/>
                 <w:szCs w:val="20"/>
               </w:rPr>
-              <w:t>Mapped current-state processes, developed SOPs, and translated root-cause findings into executive reports supporting process standardization, governance, and automation initiatives.</w:t>
+              <w:t>Built a refreshable Power Query workflow to clean, standardize, and merge monthly billing files with master data, reducing manual preparation time by approximately 50% and improving the consistency of monthly revenue reporting.</w:t>
             </w:r>
           </w:p>
         </w:tc>
@@ -1078,10 +1193,12 @@
       <w:tr>
         <w:tc>
           <w:tcPr>
-            <w:tcW w:w="8080" w:type="dxa"/>
+            <w:tcW w:w="7586" w:type="dxa"/>
+            <w:gridSpan w:val="2"/>
           </w:tcPr>
           <w:p>
             <w:pPr>
+              <w:spacing w:before="60"/>
               <w:jc w:val="both"/>
               <w:rPr>
                 <w:b/>
@@ -1097,61 +1214,17 @@
                 <w:sz w:val="20"/>
                 <w:szCs w:val="20"/>
               </w:rPr>
-              <w:t>Goldm</w:t>
-            </w:r>
-            <w:r>
-              <w:rPr>
-                <w:b/>
-                <w:bCs/>
-                <w:sz w:val="20"/>
-                <w:szCs w:val="20"/>
-              </w:rPr>
-              <w:t>a</w:t>
-            </w:r>
-            <w:r>
-              <w:rPr>
-                <w:b/>
-                <w:bCs/>
-                <w:sz w:val="20"/>
-                <w:szCs w:val="20"/>
-              </w:rPr>
-              <w:t xml:space="preserve">n Sachs | STEM </w:t>
-            </w:r>
-            <w:r>
-              <w:rPr>
-                <w:b/>
-                <w:bCs/>
-                <w:sz w:val="20"/>
-                <w:szCs w:val="20"/>
-              </w:rPr>
-              <w:t>Analyst</w:t>
-            </w:r>
-            <w:r>
-              <w:rPr>
-                <w:b/>
-                <w:bCs/>
-                <w:sz w:val="20"/>
-                <w:szCs w:val="20"/>
-              </w:rPr>
-              <w:t xml:space="preserve"> – Asset &amp; Wealth Management</w:t>
-            </w:r>
-            <w:r>
-              <w:rPr>
-                <w:b/>
-                <w:bCs/>
-                <w:sz w:val="20"/>
-                <w:szCs w:val="20"/>
-              </w:rPr>
-              <w:tab/>
+              <w:t>Beyond Key | Data Analyst Intern</w:t>
             </w:r>
           </w:p>
         </w:tc>
         <w:tc>
           <w:tcPr>
-            <w:tcW w:w="2386" w:type="dxa"/>
+            <w:tcW w:w="2880" w:type="dxa"/>
           </w:tcPr>
           <w:p>
             <w:pPr>
+              <w:spacing w:before="60"/>
               <w:jc w:val="both"/>
               <w:rPr>
                 <w:b/>
@@ -1167,7 +1240,7 @@
                 <w:sz w:val="20"/>
                 <w:szCs w:val="20"/>
               </w:rPr>
-              <w:t xml:space="preserve">   </w:t>
+              <w:t xml:space="preserve">  </w:t>
             </w:r>
             <w:r>
               <w:rPr>
@@ -1176,7 +1249,7 @@
                 <w:sz w:val="20"/>
                 <w:szCs w:val="20"/>
               </w:rPr>
-              <w:t xml:space="preserve">          </w:t>
+              <w:t xml:space="preserve">                    </w:t>
             </w:r>
             <w:r>
               <w:rPr>
@@ -1185,7 +1258,34 @@
                 <w:sz w:val="20"/>
                 <w:szCs w:val="20"/>
               </w:rPr>
-              <w:t>Feb 2023 – Jun 2023</w:t>
+              <w:t>Jan</w:t>
+            </w:r>
+            <w:r>
+              <w:rPr>
+                <w:b/>
+                <w:bCs/>
+                <w:sz w:val="20"/>
+                <w:szCs w:val="20"/>
+              </w:rPr>
+              <w:t xml:space="preserve"> 202</w:t>
+            </w:r>
+            <w:r>
+              <w:rPr>
+                <w:b/>
+                <w:bCs/>
+                <w:sz w:val="20"/>
+                <w:szCs w:val="20"/>
+              </w:rPr>
+              <w:t>2</w:t>
+            </w:r>
+            <w:r>
+              <w:rPr>
+                <w:b/>
+                <w:bCs/>
+                <w:sz w:val="20"/>
+                <w:szCs w:val="20"/>
+              </w:rPr>
+              <w:t xml:space="preserve"> – Aug 2022</w:t>
             </w:r>
           </w:p>
         </w:tc>
@@ -1194,7 +1294,7 @@
         <w:tc>
           <w:tcPr>
             <w:tcW w:w="0" w:type="auto"/>
-            <w:gridSpan w:val="2"/>
+            <w:gridSpan w:val="3"/>
           </w:tcPr>
           <w:p>
             <w:pPr>
@@ -1203,18 +1303,19 @@
                 <w:ilvl w:val="0"/>
                 <w:numId w:val="27"/>
               </w:numPr>
-              <w:jc w:val="both"/>
-              <w:rPr>
-                <w:sz w:val="20"/>
-                <w:szCs w:val="20"/>
+              <w:rPr>
+                <w:sz w:val="20"/>
+                <w:szCs w:val="20"/>
+                <w:lang w:val="en-IN"/>
               </w:rPr>
             </w:pPr>
             <w:r>
               <w:rPr>
                 <w:sz w:val="20"/>
                 <w:szCs w:val="20"/>
-              </w:rPr>
-              <w:t>Mapped Client Revenue Operations and Institutional Reporting workflows using Excel, Qlik Sense, and JIRA, identifying manual dependencies and automation opportunities.</w:t>
+                <w:lang w:val="en-IN"/>
+              </w:rPr>
+              <w:t>Retrieved, cleaned, and validated healthcare business datasets using SQL, Python, and Excel, identifying trends that supported operational and performance decisions.</w:t>
             </w:r>
           </w:p>
           <w:p>
@@ -1224,139 +1325,19 @@
                 <w:ilvl w:val="0"/>
                 <w:numId w:val="27"/>
               </w:numPr>
-              <w:jc w:val="both"/>
-              <w:rPr>
-                <w:sz w:val="20"/>
-                <w:szCs w:val="20"/>
+              <w:rPr>
+                <w:sz w:val="20"/>
+                <w:szCs w:val="20"/>
+                <w:lang w:val="en-IN"/>
               </w:rPr>
             </w:pPr>
             <w:r>
               <w:rPr>
                 <w:sz w:val="20"/>
                 <w:szCs w:val="20"/>
-              </w:rPr>
-              <w:t>Built a refreshable Power Query workflow to clean, standardize, and merge monthly billing files with master data, cutting manual prep time by roughly 50% and improving consistency of the monthly revenue dashboard.</w:t>
-            </w:r>
-          </w:p>
-          <w:p>
-            <w:pPr>
-              <w:pStyle w:val="ListParagraph"/>
-              <w:numPr>
-                <w:ilvl w:val="0"/>
-                <w:numId w:val="27"/>
-              </w:numPr>
-              <w:jc w:val="both"/>
-              <w:rPr>
-                <w:sz w:val="20"/>
-                <w:szCs w:val="20"/>
-              </w:rPr>
-            </w:pPr>
-            <w:r>
-              <w:rPr>
-                <w:sz w:val="20"/>
-                <w:szCs w:val="20"/>
-              </w:rPr>
-              <w:t>Standardized commitment names using client, portfolio, and reporting frequency, improving cross-team mapping and reducing ambiguity across recurring reports.</w:t>
-            </w:r>
-          </w:p>
-          <w:p>
-            <w:pPr>
-              <w:pStyle w:val="ListParagraph"/>
-              <w:numPr>
-                <w:ilvl w:val="0"/>
-                <w:numId w:val="27"/>
-              </w:numPr>
-              <w:jc w:val="both"/>
-              <w:rPr>
-                <w:sz w:val="20"/>
-                <w:szCs w:val="20"/>
-              </w:rPr>
-            </w:pPr>
-            <w:r>
-              <w:rPr>
-                <w:sz w:val="20"/>
-                <w:szCs w:val="20"/>
-              </w:rPr>
-              <w:t>Developed trackers for hundreds of client commitments, reporting exceptions, and follow-up actions, strengthening workflow visibility, governance, and timely execution.</w:t>
-            </w:r>
-          </w:p>
-        </w:tc>
-      </w:tr>
-      <w:tr>
-        <w:tc>
-          <w:tcPr>
-            <w:tcW w:w="8080" w:type="dxa"/>
-          </w:tcPr>
-          <w:p>
-            <w:pPr>
-              <w:jc w:val="both"/>
-              <w:rPr>
-                <w:b/>
-                <w:bCs/>
-                <w:sz w:val="20"/>
-                <w:szCs w:val="20"/>
-              </w:rPr>
-            </w:pPr>
-            <w:r>
-              <w:rPr>
-                <w:b/>
-                <w:bCs/>
-                <w:sz w:val="20"/>
-                <w:szCs w:val="20"/>
-              </w:rPr>
-              <w:t>Beyond Key | Data Analyst Intern</w:t>
-            </w:r>
-          </w:p>
-        </w:tc>
-        <w:tc>
-          <w:tcPr>
-            <w:tcW w:w="2386" w:type="dxa"/>
-          </w:tcPr>
-          <w:p>
-            <w:pPr>
-              <w:jc w:val="right"/>
-              <w:rPr>
-                <w:b/>
-                <w:bCs/>
-                <w:sz w:val="20"/>
-                <w:szCs w:val="20"/>
-              </w:rPr>
-            </w:pPr>
-            <w:r>
-              <w:rPr>
-                <w:b/>
-                <w:bCs/>
-                <w:sz w:val="20"/>
-                <w:szCs w:val="20"/>
-              </w:rPr>
-              <w:t xml:space="preserve">  </w:t>
-            </w:r>
-            <w:r>
-              <w:rPr>
-                <w:b/>
-                <w:bCs/>
-                <w:sz w:val="20"/>
-                <w:szCs w:val="20"/>
-              </w:rPr>
-              <w:t>Jun 202</w:t>
-            </w:r>
-            <w:r>
-              <w:rPr>
-                <w:b/>
-                <w:bCs/>
-                <w:sz w:val="20"/>
-                <w:szCs w:val="20"/>
-              </w:rPr>
-              <w:t>2</w:t>
-            </w:r>
-            <w:r>
-              <w:rPr>
-                <w:b/>
-                <w:bCs/>
-                <w:sz w:val="20"/>
-                <w:szCs w:val="20"/>
-              </w:rPr>
-              <w:t xml:space="preserve"> – Aug 2022</w:t>
+                <w:lang w:val="en-IN"/>
+              </w:rPr>
+              <w:t>Developed Tableau dashboards to track units sold and regional performance, enabling stakeholders to identify performance patterns across healthcare markets.</w:t>
             </w:r>
           </w:p>
         </w:tc>
@@ -1365,35 +1346,7 @@
         <w:tc>
           <w:tcPr>
             <w:tcW w:w="0" w:type="auto"/>
-            <w:gridSpan w:val="2"/>
-          </w:tcPr>
-          <w:p>
-            <w:pPr>
-              <w:pStyle w:val="ListParagraph"/>
-              <w:numPr>
-                <w:ilvl w:val="0"/>
-                <w:numId w:val="27"/>
-              </w:numPr>
-              <w:rPr>
-                <w:sz w:val="20"/>
-                <w:szCs w:val="20"/>
-              </w:rPr>
-            </w:pPr>
-            <w:r>
-              <w:rPr>
-                <w:sz w:val="20"/>
-                <w:szCs w:val="20"/>
-              </w:rPr>
-              <w:t>Analyzed regional medical-device sales data using SQL, Python, and Excel, and built Tableau and Power BI dashboards to track units sold and regional performance, helping teams identify underperforming markets.</w:t>
-            </w:r>
-          </w:p>
-        </w:tc>
-      </w:tr>
-      <w:tr>
-        <w:tc>
-          <w:tcPr>
-            <w:tcW w:w="0" w:type="auto"/>
-            <w:gridSpan w:val="2"/>
+            <w:gridSpan w:val="3"/>
             <w:tcBorders>
               <w:bottom w:val="single" w:sz="4" w:space="0" w:color="auto"/>
             </w:tcBorders>
@@ -1424,7 +1377,7 @@
         <w:tc>
           <w:tcPr>
             <w:tcW w:w="0" w:type="auto"/>
-            <w:gridSpan w:val="2"/>
+            <w:gridSpan w:val="3"/>
             <w:tcBorders>
               <w:top w:val="single" w:sz="4" w:space="0" w:color="auto"/>
             </w:tcBorders>
@@ -1476,7 +1429,7 @@
                 <w:szCs w:val="20"/>
                 <w:lang w:val="en-IN"/>
               </w:rPr>
-              <w:t xml:space="preserve"> GPA: 3.8 </w:t>
+              <w:t xml:space="preserve">   GPA: 3.8 </w:t>
             </w:r>
             <w:r>
               <w:rPr>
@@ -1515,7 +1468,18 @@
                 <w:szCs w:val="20"/>
                 <w:lang w:val="en-IN"/>
               </w:rPr>
-              <w:t>Bachelor of Technology, Biotechnology – Vellore Institute of Technology, India</w:t>
+              <w:t xml:space="preserve">Bachelor of Technology, Biotechnology – Vellore Institute of Technology, </w:t>
+            </w:r>
+            <w:proofErr w:type="gramStart"/>
+            <w:r>
+              <w:rPr>
+                <w:b/>
+                <w:bCs/>
+                <w:sz w:val="20"/>
+                <w:szCs w:val="20"/>
+                <w:lang w:val="en-IN"/>
+              </w:rPr>
+              <w:t>India</w:t>
             </w:r>
             <w:r>
               <w:rPr>
@@ -1525,7 +1489,7 @@
                 <w:szCs w:val="20"/>
                 <w:lang w:val="en-IN"/>
               </w:rPr>
-              <w:t xml:space="preserve"> GPA:</w:t>
+              <w:t xml:space="preserve"> </w:t>
             </w:r>
             <w:r>
               <w:rPr>
@@ -1535,8 +1499,9 @@
                 <w:szCs w:val="20"/>
                 <w:lang w:val="en-IN"/>
               </w:rPr>
-              <w:t xml:space="preserve"> </w:t>
-            </w:r>
+              <w:t xml:space="preserve"> GPA</w:t>
+            </w:r>
+            <w:proofErr w:type="gramEnd"/>
             <w:r>
               <w:rPr>
                 <w:i/>
@@ -1545,7 +1510,7 @@
                 <w:szCs w:val="20"/>
                 <w:lang w:val="en-IN"/>
               </w:rPr>
-              <w:t xml:space="preserve">3.5 </w:t>
+              <w:t>:</w:t>
             </w:r>
             <w:r>
               <w:rPr>
@@ -1565,6 +1530,26 @@
                 <w:szCs w:val="20"/>
                 <w:lang w:val="en-IN"/>
               </w:rPr>
+              <w:t xml:space="preserve">3.5 </w:t>
+            </w:r>
+            <w:r>
+              <w:rPr>
+                <w:i/>
+                <w:iCs/>
+                <w:sz w:val="20"/>
+                <w:szCs w:val="20"/>
+                <w:lang w:val="en-IN"/>
+              </w:rPr>
+              <w:t xml:space="preserve"> </w:t>
+            </w:r>
+            <w:r>
+              <w:rPr>
+                <w:i/>
+                <w:iCs/>
+                <w:sz w:val="20"/>
+                <w:szCs w:val="20"/>
+                <w:lang w:val="en-IN"/>
+              </w:rPr>
               <w:t xml:space="preserve">                                                   </w:t>
             </w:r>
             <w:r>
@@ -1576,6 +1561,133 @@
                 <w:lang w:val="en-IN"/>
               </w:rPr>
               <w:t>Aug 2023</w:t>
+            </w:r>
+          </w:p>
+        </w:tc>
+      </w:tr>
+      <w:tr>
+        <w:tc>
+          <w:tcPr>
+            <w:tcW w:w="0" w:type="auto"/>
+            <w:gridSpan w:val="3"/>
+          </w:tcPr>
+          <w:p>
+            <w:pPr>
+              <w:spacing w:before="120"/>
+              <w:jc w:val="both"/>
+              <w:rPr>
+                <w:b/>
+                <w:bCs/>
+                <w:sz w:val="20"/>
+                <w:szCs w:val="20"/>
+                <w:lang w:val="en-IN"/>
+              </w:rPr>
+            </w:pPr>
+            <w:r>
+              <w:rPr>
+                <w:b/>
+                <w:bCs/>
+                <w:color w:val="2F5496" w:themeColor="accent1" w:themeShade="BF"/>
+                <w:sz w:val="20"/>
+                <w:szCs w:val="20"/>
+              </w:rPr>
+              <w:t>SKILLS</w:t>
+            </w:r>
+          </w:p>
+        </w:tc>
+      </w:tr>
+      <w:tr>
+        <w:tc>
+          <w:tcPr>
+            <w:tcW w:w="0" w:type="auto"/>
+            <w:gridSpan w:val="3"/>
+            <w:tcBorders>
+              <w:top w:val="single" w:sz="4" w:space="0" w:color="auto"/>
+            </w:tcBorders>
+          </w:tcPr>
+          <w:p>
+            <w:pPr>
+              <w:jc w:val="both"/>
+              <w:rPr>
+                <w:sz w:val="20"/>
+                <w:szCs w:val="20"/>
+              </w:rPr>
+            </w:pPr>
+            <w:r>
+              <w:rPr>
+                <w:b/>
+                <w:bCs/>
+                <w:sz w:val="20"/>
+                <w:szCs w:val="20"/>
+              </w:rPr>
+              <w:t>Business Analysis:</w:t>
+            </w:r>
+            <w:r>
+              <w:rPr>
+                <w:sz w:val="20"/>
+                <w:szCs w:val="20"/>
+              </w:rPr>
+              <w:t xml:space="preserve"> Requirements Gathering, Business and Functional Requirements, User Stories, Acceptance Criteria, Backlog Support, UAT, Defect Tracking, Agile/Scrum, Process Mapping, SOPs, Root-Cause Analysis</w:t>
+            </w:r>
+            <w:r>
+              <w:rPr>
+                <w:sz w:val="20"/>
+                <w:szCs w:val="20"/>
+              </w:rPr>
+              <w:t>, BRD, FRD</w:t>
+            </w:r>
+          </w:p>
+          <w:p>
+            <w:pPr>
+              <w:jc w:val="both"/>
+              <w:rPr>
+                <w:sz w:val="20"/>
+                <w:szCs w:val="20"/>
+              </w:rPr>
+            </w:pPr>
+            <w:r>
+              <w:rPr>
+                <w:b/>
+                <w:bCs/>
+                <w:sz w:val="20"/>
+                <w:szCs w:val="20"/>
+              </w:rPr>
+              <w:t>Tools &amp; Analytics:</w:t>
+            </w:r>
+            <w:r>
+              <w:rPr>
+                <w:sz w:val="20"/>
+                <w:szCs w:val="20"/>
+              </w:rPr>
+              <w:t xml:space="preserve"> JIRA, Confluence, SharePoint, SQL, Power BI, Advanced Excel, Qlik Sense, Python, Snowflake, SAP Ariba</w:t>
+            </w:r>
+          </w:p>
+          <w:p>
+            <w:pPr>
+              <w:jc w:val="both"/>
+              <w:rPr>
+                <w:b/>
+                <w:bCs/>
+                <w:sz w:val="20"/>
+                <w:szCs w:val="20"/>
+                <w:lang w:val="en-IN"/>
+              </w:rPr>
+            </w:pPr>
+            <w:r>
+              <w:rPr>
+                <w:b/>
+                <w:bCs/>
+                <w:sz w:val="20"/>
+                <w:szCs w:val="20"/>
+              </w:rPr>
+              <w:t>Strategy &amp; Operations:</w:t>
+            </w:r>
+            <w:r>
+              <w:rPr>
+                <w:sz w:val="20"/>
+                <w:szCs w:val="20"/>
+              </w:rPr>
+              <w:t xml:space="preserve"> KPI Design, Business Cases, Process Improvement, Operational Excellence, Stakeholder Management</w:t>
             </w:r>
           </w:p>
         </w:tc>
@@ -1587,7 +1699,7 @@
         <w:tc>
           <w:tcPr>
             <w:tcW w:w="0" w:type="auto"/>
-            <w:gridSpan w:val="2"/>
+            <w:gridSpan w:val="3"/>
             <w:tcBorders>
               <w:bottom w:val="single" w:sz="4" w:space="0" w:color="auto"/>
             </w:tcBorders>
@@ -1621,7 +1733,7 @@
         <w:tc>
           <w:tcPr>
             <w:tcW w:w="0" w:type="auto"/>
-            <w:gridSpan w:val="2"/>
+            <w:gridSpan w:val="3"/>
             <w:tcBorders>
               <w:top w:val="single" w:sz="4" w:space="0" w:color="auto"/>
             </w:tcBorders>
@@ -1641,22 +1753,40 @@
               </w:rPr>
               <w:t xml:space="preserve">Beta Gamma Sigma Honor Society (Top 20% of MBA Class) </w:t>
             </w:r>
-            <w:r>
-              <w:rPr>
+            <w:proofErr w:type="gramStart"/>
+            <w:r>
+              <w:rPr>
+                <w:b/>
+                <w:bCs/>
                 <w:sz w:val="20"/>
                 <w:szCs w:val="20"/>
               </w:rPr>
               <w:t>|</w:t>
             </w:r>
             <w:r>
+              <w:rPr>
+                <w:sz w:val="20"/>
+                <w:szCs w:val="20"/>
+              </w:rPr>
               <w:t xml:space="preserve"> </w:t>
             </w:r>
             <w:r>
-              <w:rPr>
-                <w:sz w:val="20"/>
-                <w:szCs w:val="20"/>
-              </w:rPr>
-              <w:t>Award for Best Graduate Teaching Assistant, Statistics</w:t>
+              <w:t xml:space="preserve"> </w:t>
+            </w:r>
+            <w:r>
+              <w:rPr>
+                <w:sz w:val="20"/>
+                <w:szCs w:val="20"/>
+              </w:rPr>
+              <w:t>Award</w:t>
+            </w:r>
+            <w:proofErr w:type="gramEnd"/>
+            <w:r>
+              <w:rPr>
+                <w:sz w:val="20"/>
+                <w:szCs w:val="20"/>
+              </w:rPr>
+              <w:t xml:space="preserve"> for Best Graduate Teaching Assistant, Statistics</w:t>
             </w:r>
           </w:p>
           <w:p>
@@ -1679,14 +1809,42 @@
                 <w:sz w:val="20"/>
                 <w:szCs w:val="20"/>
               </w:rPr>
-              <w:t xml:space="preserve"> | </w:t>
-            </w:r>
-            <w:r>
-              <w:rPr>
-                <w:sz w:val="20"/>
-                <w:szCs w:val="20"/>
-              </w:rPr>
-              <w:t>Make A Difference Volunteer Educator, 150+ teaching hours</w:t>
+              <w:t xml:space="preserve"> </w:t>
+            </w:r>
+            <w:proofErr w:type="gramStart"/>
+            <w:r>
+              <w:rPr>
+                <w:b/>
+                <w:bCs/>
+                <w:sz w:val="20"/>
+                <w:szCs w:val="20"/>
+              </w:rPr>
+              <w:t>|</w:t>
+            </w:r>
+            <w:r>
+              <w:rPr>
+                <w:sz w:val="20"/>
+                <w:szCs w:val="20"/>
+              </w:rPr>
+              <w:t xml:space="preserve"> </w:t>
+            </w:r>
+            <w:r>
+              <w:t xml:space="preserve"> </w:t>
+            </w:r>
+            <w:r>
+              <w:rPr>
+                <w:sz w:val="20"/>
+                <w:szCs w:val="20"/>
+              </w:rPr>
+              <w:t>Make</w:t>
+            </w:r>
+            <w:proofErr w:type="gramEnd"/>
+            <w:r>
+              <w:rPr>
+                <w:sz w:val="20"/>
+                <w:szCs w:val="20"/>
+              </w:rPr>
+              <w:t xml:space="preserve"> A Difference Volunteer Educator, 150+ teaching hours</w:t>
             </w:r>
           </w:p>
         </w:tc>

</xml_diff>